<commit_message>
end of az os proje
</commit_message>
<xml_diff>
--- a/آز سیستم عامل/ارائه سیستم عامل.docx
+++ b/آز سیستم عامل/ارائه سیستم عامل.docx
@@ -5,71 +5,1265 @@
     <w:p>
       <w:pPr>
         <w:ind w:left="0"/>
-        <w:jc w:val="left"/>
-        <w:rPr>
-          <w:rtl/>
-          <w:lang w:bidi="fa-IR"/>
-        </w:rPr>
-      </w:pPr>
+        <w:jc w:val="center"/>
+        <w:rPr>
+          <w:rFonts w:cs="B Titr"/>
+          <w:sz w:val="48"/>
+          <w:szCs w:val="48"/>
+          <w:rtl/>
+          <w:lang w:bidi="fa-IR"/>
+        </w:rPr>
+      </w:pPr>
+      <w:r>
+        <w:rPr>
+          <w:rFonts w:cs="B Titr" w:hint="cs"/>
+          <w:sz w:val="48"/>
+          <w:szCs w:val="48"/>
+          <w:rtl/>
+          <w:lang w:bidi="fa-IR"/>
+        </w:rPr>
+        <w:t>ارائه سیستم</w:t>
+      </w:r>
+      <w:r>
+        <w:rPr>
+          <w:rFonts w:cs="B Titr"/>
+          <w:sz w:val="48"/>
+          <w:szCs w:val="48"/>
+          <w:rtl/>
+          <w:lang w:bidi="fa-IR"/>
+        </w:rPr>
+        <w:softHyphen/>
+      </w:r>
+      <w:r>
+        <w:rPr>
+          <w:rFonts w:cs="B Titr" w:hint="cs"/>
+          <w:sz w:val="48"/>
+          <w:szCs w:val="48"/>
+          <w:rtl/>
+          <w:lang w:bidi="fa-IR"/>
+        </w:rPr>
+        <w:t>های عامل</w:t>
+      </w:r>
+    </w:p>
+    <w:p>
+      <w:pPr>
+        <w:bidi w:val="0"/>
+        <w:ind w:left="0"/>
+        <w:jc w:val="left"/>
+        <w:rPr>
+          <w:rFonts w:asciiTheme="minorHAnsi" w:hAnsiTheme="minorHAnsi" w:cs="B Titr"/>
+          <w:sz w:val="48"/>
+          <w:szCs w:val="48"/>
+          <w:rtl/>
+          <w:lang w:bidi="fa-IR"/>
+        </w:rPr>
+      </w:pPr>
+      <w:r>
+        <w:rPr>
+          <w:rFonts w:cs="B Titr"/>
+          <w:sz w:val="48"/>
+          <w:szCs w:val="48"/>
+          <w:rtl/>
+          <w:lang w:bidi="fa-IR"/>
+        </w:rPr>
+        <w:br w:type="page"/>
+      </w:r>
+    </w:p>
+    <w:sdt>
+      <w:sdtPr>
+        <w:id w:val="-1390422879"/>
+        <w:docPartObj>
+          <w:docPartGallery w:val="Table of Contents"/>
+          <w:docPartUnique/>
+        </w:docPartObj>
+      </w:sdtPr>
+      <w:sdtEndPr>
+        <w:rPr>
+          <w:rFonts w:ascii="B Nazanin" w:eastAsiaTheme="minorHAnsi" w:hAnsi="B Nazanin" w:cs="B Nazanin"/>
+          <w:b/>
+          <w:bCs/>
+          <w:noProof/>
+          <w:color w:val="auto"/>
+          <w:kern w:val="2"/>
+          <w:sz w:val="28"/>
+          <w:szCs w:val="28"/>
+          <w:rtl/>
+          <w14:ligatures w14:val="standardContextual"/>
+        </w:rPr>
+      </w:sdtEndPr>
+      <w:sdtContent>
+        <w:p>
+          <w:pPr>
+            <w:pStyle w:val="TOCHeading"/>
+            <w:tabs>
+              <w:tab w:val="right" w:pos="9360"/>
+            </w:tabs>
+            <w:jc w:val="center"/>
+            <w:rPr>
+              <w:rFonts w:hint="cs"/>
+              <w:rtl/>
+              <w:lang w:bidi="fa-IR"/>
+            </w:rPr>
+          </w:pPr>
+          <w:r>
+            <w:rPr>
+              <w:rFonts w:hint="cs"/>
+              <w:rtl/>
+              <w:lang w:bidi="fa-IR"/>
+            </w:rPr>
+            <w:t>فهرست</w:t>
+          </w:r>
+        </w:p>
+        <w:p>
+          <w:pPr>
+            <w:pStyle w:val="TOC1"/>
+            <w:tabs>
+              <w:tab w:val="right" w:leader="dot" w:pos="9350"/>
+            </w:tabs>
+            <w:jc w:val="both"/>
+            <w:rPr>
+              <w:noProof/>
+            </w:rPr>
+          </w:pPr>
+          <w:r>
+            <w:fldChar w:fldCharType="begin"/>
+          </w:r>
+          <w:r>
+            <w:instrText xml:space="preserve"> TOC \o "1-3" \h \z \u </w:instrText>
+          </w:r>
+          <w:r>
+            <w:fldChar w:fldCharType="separate"/>
+          </w:r>
+          <w:hyperlink w:anchor="_Toc212025644" w:history="1">
+            <w:r>
+              <w:rPr>
+                <w:rStyle w:val="Hyperlink"/>
+                <w:noProof/>
+                <w:rtl/>
+                <w:lang w:bidi="fa-IR"/>
+              </w:rPr>
+              <w:t>فصل اول ـ وجود ح</w:t>
+            </w:r>
+            <w:r>
+              <w:rPr>
+                <w:rStyle w:val="Hyperlink"/>
+                <w:rFonts w:hint="cs"/>
+                <w:noProof/>
+                <w:rtl/>
+                <w:lang w:bidi="fa-IR"/>
+              </w:rPr>
+              <w:t>ی</w:t>
+            </w:r>
+            <w:r>
+              <w:rPr>
+                <w:rStyle w:val="Hyperlink"/>
+                <w:rFonts w:hint="eastAsia"/>
+                <w:noProof/>
+                <w:rtl/>
+                <w:lang w:bidi="fa-IR"/>
+              </w:rPr>
+              <w:t>ات</w:t>
+            </w:r>
+            <w:r>
+              <w:rPr>
+                <w:rStyle w:val="Hyperlink"/>
+                <w:rFonts w:hint="cs"/>
+                <w:noProof/>
+                <w:rtl/>
+                <w:lang w:bidi="fa-IR"/>
+              </w:rPr>
+              <w:t>ی</w:t>
+            </w:r>
+            <w:r>
+              <w:rPr>
+                <w:rStyle w:val="Hyperlink"/>
+                <w:noProof/>
+                <w:rtl/>
+                <w:lang w:bidi="fa-IR"/>
+              </w:rPr>
+              <w:t xml:space="preserve"> به س</w:t>
+            </w:r>
+            <w:r>
+              <w:rPr>
+                <w:rStyle w:val="Hyperlink"/>
+                <w:rFonts w:hint="cs"/>
+                <w:noProof/>
+                <w:rtl/>
+                <w:lang w:bidi="fa-IR"/>
+              </w:rPr>
+              <w:t>ی</w:t>
+            </w:r>
+            <w:r>
+              <w:rPr>
+                <w:rStyle w:val="Hyperlink"/>
+                <w:rFonts w:hint="eastAsia"/>
+                <w:noProof/>
+                <w:rtl/>
+                <w:lang w:bidi="fa-IR"/>
+              </w:rPr>
+              <w:t>ستم</w:t>
+            </w:r>
+            <w:r>
+              <w:rPr>
+                <w:rStyle w:val="Hyperlink"/>
+                <w:noProof/>
+                <w:rtl/>
+                <w:lang w:bidi="fa-IR"/>
+              </w:rPr>
+              <w:t xml:space="preserve"> عامل</w:t>
+            </w:r>
+            <w:r>
+              <w:rPr>
+                <w:noProof/>
+                <w:webHidden/>
+              </w:rPr>
+              <w:tab/>
+            </w:r>
+            <w:r>
+              <w:rPr>
+                <w:noProof/>
+                <w:webHidden/>
+              </w:rPr>
+              <w:fldChar w:fldCharType="begin"/>
+            </w:r>
+            <w:r>
+              <w:rPr>
+                <w:noProof/>
+                <w:webHidden/>
+              </w:rPr>
+              <w:instrText xml:space="preserve"> PAGEREF _Toc212025644 \h </w:instrText>
+            </w:r>
+            <w:r>
+              <w:rPr>
+                <w:noProof/>
+                <w:webHidden/>
+              </w:rPr>
+            </w:r>
+            <w:r>
+              <w:rPr>
+                <w:noProof/>
+                <w:webHidden/>
+              </w:rPr>
+              <w:fldChar w:fldCharType="separate"/>
+            </w:r>
+            <w:r>
+              <w:rPr>
+                <w:noProof/>
+                <w:webHidden/>
+                <w:rtl/>
+              </w:rPr>
+              <w:t>3</w:t>
+            </w:r>
+            <w:r>
+              <w:rPr>
+                <w:noProof/>
+                <w:webHidden/>
+              </w:rPr>
+              <w:fldChar w:fldCharType="end"/>
+            </w:r>
+          </w:hyperlink>
+        </w:p>
+        <w:p>
+          <w:pPr>
+            <w:pStyle w:val="TOC2"/>
+            <w:tabs>
+              <w:tab w:val="right" w:leader="dot" w:pos="9350"/>
+            </w:tabs>
+            <w:rPr>
+              <w:noProof/>
+            </w:rPr>
+          </w:pPr>
+          <w:hyperlink w:anchor="_Toc212025645" w:history="1">
+            <w:r>
+              <w:rPr>
+                <w:rStyle w:val="Hyperlink"/>
+                <w:noProof/>
+                <w:rtl/>
+                <w:lang w:bidi="fa-IR"/>
+              </w:rPr>
+              <w:t>بخش اول ـ مشکلات نبود س</w:t>
+            </w:r>
+            <w:r>
+              <w:rPr>
+                <w:rStyle w:val="Hyperlink"/>
+                <w:rFonts w:hint="cs"/>
+                <w:noProof/>
+                <w:rtl/>
+                <w:lang w:bidi="fa-IR"/>
+              </w:rPr>
+              <w:t>ی</w:t>
+            </w:r>
+            <w:r>
+              <w:rPr>
+                <w:rStyle w:val="Hyperlink"/>
+                <w:rFonts w:hint="eastAsia"/>
+                <w:noProof/>
+                <w:rtl/>
+                <w:lang w:bidi="fa-IR"/>
+              </w:rPr>
+              <w:t>ستم</w:t>
+            </w:r>
+            <w:r>
+              <w:rPr>
+                <w:rStyle w:val="Hyperlink"/>
+                <w:noProof/>
+                <w:rtl/>
+                <w:lang w:bidi="fa-IR"/>
+              </w:rPr>
+              <w:t xml:space="preserve"> عامل</w:t>
+            </w:r>
+            <w:r>
+              <w:rPr>
+                <w:noProof/>
+                <w:webHidden/>
+              </w:rPr>
+              <w:tab/>
+            </w:r>
+            <w:r>
+              <w:rPr>
+                <w:noProof/>
+                <w:webHidden/>
+              </w:rPr>
+              <w:fldChar w:fldCharType="begin"/>
+            </w:r>
+            <w:r>
+              <w:rPr>
+                <w:noProof/>
+                <w:webHidden/>
+              </w:rPr>
+              <w:instrText xml:space="preserve"> PAGEREF _Toc212025645 \h </w:instrText>
+            </w:r>
+            <w:r>
+              <w:rPr>
+                <w:noProof/>
+                <w:webHidden/>
+              </w:rPr>
+            </w:r>
+            <w:r>
+              <w:rPr>
+                <w:noProof/>
+                <w:webHidden/>
+              </w:rPr>
+              <w:fldChar w:fldCharType="separate"/>
+            </w:r>
+            <w:r>
+              <w:rPr>
+                <w:noProof/>
+                <w:webHidden/>
+                <w:rtl/>
+              </w:rPr>
+              <w:t>3</w:t>
+            </w:r>
+            <w:r>
+              <w:rPr>
+                <w:noProof/>
+                <w:webHidden/>
+              </w:rPr>
+              <w:fldChar w:fldCharType="end"/>
+            </w:r>
+          </w:hyperlink>
+        </w:p>
+        <w:p>
+          <w:pPr>
+            <w:pStyle w:val="TOC2"/>
+            <w:tabs>
+              <w:tab w:val="right" w:leader="dot" w:pos="9350"/>
+            </w:tabs>
+            <w:rPr>
+              <w:noProof/>
+            </w:rPr>
+          </w:pPr>
+          <w:hyperlink w:anchor="_Toc212025646" w:history="1">
+            <w:r>
+              <w:rPr>
+                <w:rStyle w:val="Hyperlink"/>
+                <w:noProof/>
+                <w:rtl/>
+              </w:rPr>
+              <w:t>بخش دوم معرف</w:t>
+            </w:r>
+            <w:r>
+              <w:rPr>
+                <w:rStyle w:val="Hyperlink"/>
+                <w:rFonts w:hint="cs"/>
+                <w:noProof/>
+                <w:rtl/>
+              </w:rPr>
+              <w:t>ی</w:t>
+            </w:r>
+            <w:r>
+              <w:rPr>
+                <w:rStyle w:val="Hyperlink"/>
+                <w:noProof/>
+                <w:rtl/>
+              </w:rPr>
+              <w:t xml:space="preserve"> س</w:t>
+            </w:r>
+            <w:r>
+              <w:rPr>
+                <w:rStyle w:val="Hyperlink"/>
+                <w:rFonts w:hint="cs"/>
+                <w:noProof/>
+                <w:rtl/>
+              </w:rPr>
+              <w:t>ی</w:t>
+            </w:r>
+            <w:r>
+              <w:rPr>
+                <w:rStyle w:val="Hyperlink"/>
+                <w:rFonts w:hint="eastAsia"/>
+                <w:noProof/>
+                <w:rtl/>
+              </w:rPr>
+              <w:t>ستم</w:t>
+            </w:r>
+            <w:r>
+              <w:rPr>
+                <w:rStyle w:val="Hyperlink"/>
+                <w:noProof/>
+                <w:rtl/>
+              </w:rPr>
+              <w:t xml:space="preserve"> عامل</w:t>
+            </w:r>
+            <w:r>
+              <w:rPr>
+                <w:noProof/>
+                <w:webHidden/>
+              </w:rPr>
+              <w:tab/>
+            </w:r>
+            <w:r>
+              <w:rPr>
+                <w:noProof/>
+                <w:webHidden/>
+              </w:rPr>
+              <w:fldChar w:fldCharType="begin"/>
+            </w:r>
+            <w:r>
+              <w:rPr>
+                <w:noProof/>
+                <w:webHidden/>
+              </w:rPr>
+              <w:instrText xml:space="preserve"> PAGEREF _Toc212025646 \h </w:instrText>
+            </w:r>
+            <w:r>
+              <w:rPr>
+                <w:noProof/>
+                <w:webHidden/>
+              </w:rPr>
+            </w:r>
+            <w:r>
+              <w:rPr>
+                <w:noProof/>
+                <w:webHidden/>
+              </w:rPr>
+              <w:fldChar w:fldCharType="separate"/>
+            </w:r>
+            <w:r>
+              <w:rPr>
+                <w:noProof/>
+                <w:webHidden/>
+                <w:rtl/>
+              </w:rPr>
+              <w:t>4</w:t>
+            </w:r>
+            <w:r>
+              <w:rPr>
+                <w:noProof/>
+                <w:webHidden/>
+              </w:rPr>
+              <w:fldChar w:fldCharType="end"/>
+            </w:r>
+          </w:hyperlink>
+        </w:p>
+        <w:p>
+          <w:pPr>
+            <w:pStyle w:val="TOC2"/>
+            <w:tabs>
+              <w:tab w:val="right" w:leader="dot" w:pos="9350"/>
+            </w:tabs>
+            <w:rPr>
+              <w:noProof/>
+            </w:rPr>
+          </w:pPr>
+          <w:hyperlink w:anchor="_Toc212025647" w:history="1">
+            <w:r>
+              <w:rPr>
+                <w:rStyle w:val="Hyperlink"/>
+                <w:noProof/>
+                <w:rtl/>
+              </w:rPr>
+              <w:t>بخش سوم تار</w:t>
+            </w:r>
+            <w:r>
+              <w:rPr>
+                <w:rStyle w:val="Hyperlink"/>
+                <w:rFonts w:hint="cs"/>
+                <w:noProof/>
+                <w:rtl/>
+              </w:rPr>
+              <w:t>ی</w:t>
+            </w:r>
+            <w:r>
+              <w:rPr>
+                <w:rStyle w:val="Hyperlink"/>
+                <w:rFonts w:hint="eastAsia"/>
+                <w:noProof/>
+                <w:rtl/>
+              </w:rPr>
+              <w:t>خچه</w:t>
+            </w:r>
+            <w:r>
+              <w:rPr>
+                <w:rStyle w:val="Hyperlink"/>
+                <w:noProof/>
+                <w:rtl/>
+              </w:rPr>
+              <w:t xml:space="preserve"> س</w:t>
+            </w:r>
+            <w:r>
+              <w:rPr>
+                <w:rStyle w:val="Hyperlink"/>
+                <w:rFonts w:hint="cs"/>
+                <w:noProof/>
+                <w:rtl/>
+              </w:rPr>
+              <w:t>ی</w:t>
+            </w:r>
+            <w:r>
+              <w:rPr>
+                <w:rStyle w:val="Hyperlink"/>
+                <w:rFonts w:hint="eastAsia"/>
+                <w:noProof/>
+                <w:rtl/>
+              </w:rPr>
+              <w:t>ستم</w:t>
+            </w:r>
+            <w:r>
+              <w:rPr>
+                <w:rStyle w:val="Hyperlink"/>
+                <w:noProof/>
+                <w:rtl/>
+              </w:rPr>
+              <w:t xml:space="preserve"> عامل</w:t>
+            </w:r>
+            <w:r>
+              <w:rPr>
+                <w:noProof/>
+                <w:webHidden/>
+              </w:rPr>
+              <w:tab/>
+            </w:r>
+            <w:r>
+              <w:rPr>
+                <w:noProof/>
+                <w:webHidden/>
+              </w:rPr>
+              <w:fldChar w:fldCharType="begin"/>
+            </w:r>
+            <w:r>
+              <w:rPr>
+                <w:noProof/>
+                <w:webHidden/>
+              </w:rPr>
+              <w:instrText xml:space="preserve"> PAGEREF _Toc212025647 \h </w:instrText>
+            </w:r>
+            <w:r>
+              <w:rPr>
+                <w:noProof/>
+                <w:webHidden/>
+              </w:rPr>
+            </w:r>
+            <w:r>
+              <w:rPr>
+                <w:noProof/>
+                <w:webHidden/>
+              </w:rPr>
+              <w:fldChar w:fldCharType="separate"/>
+            </w:r>
+            <w:r>
+              <w:rPr>
+                <w:noProof/>
+                <w:webHidden/>
+                <w:rtl/>
+              </w:rPr>
+              <w:t>5</w:t>
+            </w:r>
+            <w:r>
+              <w:rPr>
+                <w:noProof/>
+                <w:webHidden/>
+              </w:rPr>
+              <w:fldChar w:fldCharType="end"/>
+            </w:r>
+          </w:hyperlink>
+        </w:p>
+        <w:p>
+          <w:pPr>
+            <w:pStyle w:val="TOC2"/>
+            <w:tabs>
+              <w:tab w:val="right" w:leader="dot" w:pos="9350"/>
+            </w:tabs>
+            <w:rPr>
+              <w:noProof/>
+            </w:rPr>
+          </w:pPr>
+          <w:hyperlink w:anchor="_Toc212025648" w:history="1">
+            <w:r>
+              <w:rPr>
+                <w:rStyle w:val="Hyperlink"/>
+                <w:noProof/>
+                <w:rtl/>
+              </w:rPr>
+              <w:t>بخش چهارم وظا</w:t>
+            </w:r>
+            <w:r>
+              <w:rPr>
+                <w:rStyle w:val="Hyperlink"/>
+                <w:rFonts w:hint="cs"/>
+                <w:noProof/>
+                <w:rtl/>
+              </w:rPr>
+              <w:t>ی</w:t>
+            </w:r>
+            <w:r>
+              <w:rPr>
+                <w:rStyle w:val="Hyperlink"/>
+                <w:rFonts w:hint="eastAsia"/>
+                <w:noProof/>
+                <w:rtl/>
+              </w:rPr>
+              <w:t>ف</w:t>
+            </w:r>
+            <w:r>
+              <w:rPr>
+                <w:rStyle w:val="Hyperlink"/>
+                <w:noProof/>
+                <w:rtl/>
+              </w:rPr>
+              <w:t xml:space="preserve"> س</w:t>
+            </w:r>
+            <w:r>
+              <w:rPr>
+                <w:rStyle w:val="Hyperlink"/>
+                <w:rFonts w:hint="cs"/>
+                <w:noProof/>
+                <w:rtl/>
+              </w:rPr>
+              <w:t>ی</w:t>
+            </w:r>
+            <w:r>
+              <w:rPr>
+                <w:rStyle w:val="Hyperlink"/>
+                <w:rFonts w:hint="eastAsia"/>
+                <w:noProof/>
+                <w:rtl/>
+              </w:rPr>
+              <w:t>ستم</w:t>
+            </w:r>
+            <w:r>
+              <w:rPr>
+                <w:rStyle w:val="Hyperlink"/>
+                <w:noProof/>
+                <w:rtl/>
+              </w:rPr>
+              <w:t xml:space="preserve"> عامل</w:t>
+            </w:r>
+            <w:r>
+              <w:rPr>
+                <w:noProof/>
+                <w:webHidden/>
+              </w:rPr>
+              <w:tab/>
+            </w:r>
+            <w:r>
+              <w:rPr>
+                <w:noProof/>
+                <w:webHidden/>
+              </w:rPr>
+              <w:fldChar w:fldCharType="begin"/>
+            </w:r>
+            <w:r>
+              <w:rPr>
+                <w:noProof/>
+                <w:webHidden/>
+              </w:rPr>
+              <w:instrText xml:space="preserve"> PAGEREF _Toc212025648 \h </w:instrText>
+            </w:r>
+            <w:r>
+              <w:rPr>
+                <w:noProof/>
+                <w:webHidden/>
+              </w:rPr>
+            </w:r>
+            <w:r>
+              <w:rPr>
+                <w:noProof/>
+                <w:webHidden/>
+              </w:rPr>
+              <w:fldChar w:fldCharType="separate"/>
+            </w:r>
+            <w:r>
+              <w:rPr>
+                <w:noProof/>
+                <w:webHidden/>
+                <w:rtl/>
+              </w:rPr>
+              <w:t>7</w:t>
+            </w:r>
+            <w:r>
+              <w:rPr>
+                <w:noProof/>
+                <w:webHidden/>
+              </w:rPr>
+              <w:fldChar w:fldCharType="end"/>
+            </w:r>
+          </w:hyperlink>
+        </w:p>
+        <w:p>
+          <w:pPr>
+            <w:pStyle w:val="TOC1"/>
+            <w:tabs>
+              <w:tab w:val="right" w:leader="dot" w:pos="9350"/>
+            </w:tabs>
+            <w:rPr>
+              <w:noProof/>
+            </w:rPr>
+          </w:pPr>
+          <w:hyperlink w:anchor="_Toc212025649" w:history="1">
+            <w:r>
+              <w:rPr>
+                <w:rStyle w:val="Hyperlink"/>
+                <w:noProof/>
+                <w:rtl/>
+                <w:lang w:bidi="fa-IR"/>
+              </w:rPr>
+              <w:t>فصل دوم ـ انواع ساختار س</w:t>
+            </w:r>
+            <w:r>
+              <w:rPr>
+                <w:rStyle w:val="Hyperlink"/>
+                <w:rFonts w:hint="cs"/>
+                <w:noProof/>
+                <w:rtl/>
+                <w:lang w:bidi="fa-IR"/>
+              </w:rPr>
+              <w:t>ی</w:t>
+            </w:r>
+            <w:r>
+              <w:rPr>
+                <w:rStyle w:val="Hyperlink"/>
+                <w:rFonts w:hint="eastAsia"/>
+                <w:noProof/>
+                <w:rtl/>
+                <w:lang w:bidi="fa-IR"/>
+              </w:rPr>
+              <w:t>ستم</w:t>
+            </w:r>
+            <w:r>
+              <w:rPr>
+                <w:rStyle w:val="Hyperlink"/>
+                <w:noProof/>
+                <w:rtl/>
+                <w:lang w:bidi="fa-IR"/>
+              </w:rPr>
+              <w:t xml:space="preserve"> عامل ها</w:t>
+            </w:r>
+            <w:r>
+              <w:rPr>
+                <w:noProof/>
+                <w:webHidden/>
+              </w:rPr>
+              <w:tab/>
+            </w:r>
+            <w:r>
+              <w:rPr>
+                <w:noProof/>
+                <w:webHidden/>
+              </w:rPr>
+              <w:fldChar w:fldCharType="begin"/>
+            </w:r>
+            <w:r>
+              <w:rPr>
+                <w:noProof/>
+                <w:webHidden/>
+              </w:rPr>
+              <w:instrText xml:space="preserve"> PAGEREF _Toc212025649 \h </w:instrText>
+            </w:r>
+            <w:r>
+              <w:rPr>
+                <w:noProof/>
+                <w:webHidden/>
+              </w:rPr>
+            </w:r>
+            <w:r>
+              <w:rPr>
+                <w:noProof/>
+                <w:webHidden/>
+              </w:rPr>
+              <w:fldChar w:fldCharType="separate"/>
+            </w:r>
+            <w:r>
+              <w:rPr>
+                <w:noProof/>
+                <w:webHidden/>
+                <w:rtl/>
+              </w:rPr>
+              <w:t>11</w:t>
+            </w:r>
+            <w:r>
+              <w:rPr>
+                <w:noProof/>
+                <w:webHidden/>
+              </w:rPr>
+              <w:fldChar w:fldCharType="end"/>
+            </w:r>
+          </w:hyperlink>
+        </w:p>
+        <w:p>
+          <w:pPr>
+            <w:pStyle w:val="TOC2"/>
+            <w:tabs>
+              <w:tab w:val="right" w:leader="dot" w:pos="9350"/>
+            </w:tabs>
+            <w:rPr>
+              <w:noProof/>
+            </w:rPr>
+          </w:pPr>
+          <w:hyperlink w:anchor="_Toc212025650" w:history="1">
+            <w:r>
+              <w:rPr>
+                <w:rStyle w:val="Hyperlink"/>
+                <w:noProof/>
+                <w:rtl/>
+                <w:lang w:bidi="fa-IR"/>
+              </w:rPr>
+              <w:t>بخش اول ـ معرف</w:t>
+            </w:r>
+            <w:r>
+              <w:rPr>
+                <w:rStyle w:val="Hyperlink"/>
+                <w:rFonts w:hint="cs"/>
+                <w:noProof/>
+                <w:rtl/>
+                <w:lang w:bidi="fa-IR"/>
+              </w:rPr>
+              <w:t>ی</w:t>
+            </w:r>
+            <w:r>
+              <w:rPr>
+                <w:rStyle w:val="Hyperlink"/>
+                <w:noProof/>
+                <w:rtl/>
+                <w:lang w:bidi="fa-IR"/>
+              </w:rPr>
+              <w:t xml:space="preserve"> انواع س</w:t>
+            </w:r>
+            <w:r>
+              <w:rPr>
+                <w:rStyle w:val="Hyperlink"/>
+                <w:rFonts w:hint="cs"/>
+                <w:noProof/>
+                <w:rtl/>
+                <w:lang w:bidi="fa-IR"/>
+              </w:rPr>
+              <w:t>ی</w:t>
+            </w:r>
+            <w:r>
+              <w:rPr>
+                <w:rStyle w:val="Hyperlink"/>
+                <w:rFonts w:hint="eastAsia"/>
+                <w:noProof/>
+                <w:rtl/>
+                <w:lang w:bidi="fa-IR"/>
+              </w:rPr>
+              <w:t>ستم</w:t>
+            </w:r>
+            <w:r>
+              <w:rPr>
+                <w:rStyle w:val="Hyperlink"/>
+                <w:noProof/>
+                <w:rtl/>
+                <w:lang w:bidi="fa-IR"/>
+              </w:rPr>
+              <w:t xml:space="preserve"> عامل ها</w:t>
+            </w:r>
+            <w:r>
+              <w:rPr>
+                <w:noProof/>
+                <w:webHidden/>
+              </w:rPr>
+              <w:tab/>
+            </w:r>
+            <w:r>
+              <w:rPr>
+                <w:noProof/>
+                <w:webHidden/>
+              </w:rPr>
+              <w:fldChar w:fldCharType="begin"/>
+            </w:r>
+            <w:r>
+              <w:rPr>
+                <w:noProof/>
+                <w:webHidden/>
+              </w:rPr>
+              <w:instrText xml:space="preserve"> PAGEREF _Toc212025650 \h </w:instrText>
+            </w:r>
+            <w:r>
+              <w:rPr>
+                <w:noProof/>
+                <w:webHidden/>
+              </w:rPr>
+            </w:r>
+            <w:r>
+              <w:rPr>
+                <w:noProof/>
+                <w:webHidden/>
+              </w:rPr>
+              <w:fldChar w:fldCharType="separate"/>
+            </w:r>
+            <w:r>
+              <w:rPr>
+                <w:noProof/>
+                <w:webHidden/>
+                <w:rtl/>
+              </w:rPr>
+              <w:t>11</w:t>
+            </w:r>
+            <w:r>
+              <w:rPr>
+                <w:noProof/>
+                <w:webHidden/>
+              </w:rPr>
+              <w:fldChar w:fldCharType="end"/>
+            </w:r>
+          </w:hyperlink>
+        </w:p>
+        <w:p>
+          <w:pPr>
+            <w:pStyle w:val="TOC2"/>
+            <w:tabs>
+              <w:tab w:val="right" w:leader="dot" w:pos="9350"/>
+            </w:tabs>
+            <w:rPr>
+              <w:noProof/>
+            </w:rPr>
+          </w:pPr>
+          <w:hyperlink w:anchor="_Toc212025651" w:history="1">
+            <w:r>
+              <w:rPr>
+                <w:rStyle w:val="Hyperlink"/>
+                <w:noProof/>
+                <w:rtl/>
+                <w:lang w:bidi="fa-IR"/>
+              </w:rPr>
+              <w:t>بخش دوم ـ ساختار ها</w:t>
+            </w:r>
+            <w:r>
+              <w:rPr>
+                <w:rStyle w:val="Hyperlink"/>
+                <w:rFonts w:hint="cs"/>
+                <w:noProof/>
+                <w:rtl/>
+                <w:lang w:bidi="fa-IR"/>
+              </w:rPr>
+              <w:t>ی</w:t>
+            </w:r>
+            <w:r>
+              <w:rPr>
+                <w:rStyle w:val="Hyperlink"/>
+                <w:noProof/>
+                <w:rtl/>
+                <w:lang w:bidi="fa-IR"/>
+              </w:rPr>
+              <w:t xml:space="preserve"> س</w:t>
+            </w:r>
+            <w:r>
+              <w:rPr>
+                <w:rStyle w:val="Hyperlink"/>
+                <w:rFonts w:hint="cs"/>
+                <w:noProof/>
+                <w:rtl/>
+                <w:lang w:bidi="fa-IR"/>
+              </w:rPr>
+              <w:t>ی</w:t>
+            </w:r>
+            <w:r>
+              <w:rPr>
+                <w:rStyle w:val="Hyperlink"/>
+                <w:rFonts w:hint="eastAsia"/>
+                <w:noProof/>
+                <w:rtl/>
+                <w:lang w:bidi="fa-IR"/>
+              </w:rPr>
+              <w:t>ستم</w:t>
+            </w:r>
+            <w:r>
+              <w:rPr>
+                <w:rStyle w:val="Hyperlink"/>
+                <w:noProof/>
+                <w:rtl/>
+                <w:lang w:bidi="fa-IR"/>
+              </w:rPr>
+              <w:t xml:space="preserve"> عامل ها</w:t>
+            </w:r>
+            <w:r>
+              <w:rPr>
+                <w:noProof/>
+                <w:webHidden/>
+              </w:rPr>
+              <w:tab/>
+            </w:r>
+            <w:r>
+              <w:rPr>
+                <w:noProof/>
+                <w:webHidden/>
+              </w:rPr>
+              <w:fldChar w:fldCharType="begin"/>
+            </w:r>
+            <w:r>
+              <w:rPr>
+                <w:noProof/>
+                <w:webHidden/>
+              </w:rPr>
+              <w:instrText xml:space="preserve"> PAGEREF _Toc212025651 \h </w:instrText>
+            </w:r>
+            <w:r>
+              <w:rPr>
+                <w:noProof/>
+                <w:webHidden/>
+              </w:rPr>
+            </w:r>
+            <w:r>
+              <w:rPr>
+                <w:noProof/>
+                <w:webHidden/>
+              </w:rPr>
+              <w:fldChar w:fldCharType="separate"/>
+            </w:r>
+            <w:r>
+              <w:rPr>
+                <w:noProof/>
+                <w:webHidden/>
+                <w:rtl/>
+              </w:rPr>
+              <w:t>12</w:t>
+            </w:r>
+            <w:r>
+              <w:rPr>
+                <w:noProof/>
+                <w:webHidden/>
+              </w:rPr>
+              <w:fldChar w:fldCharType="end"/>
+            </w:r>
+          </w:hyperlink>
+        </w:p>
+        <w:p>
+          <w:pPr>
+            <w:pStyle w:val="TOC2"/>
+            <w:tabs>
+              <w:tab w:val="right" w:leader="dot" w:pos="9350"/>
+            </w:tabs>
+            <w:rPr>
+              <w:noProof/>
+            </w:rPr>
+          </w:pPr>
+          <w:hyperlink w:anchor="_Toc212025652" w:history="1">
+            <w:r>
+              <w:rPr>
+                <w:rStyle w:val="Hyperlink"/>
+                <w:noProof/>
+                <w:rtl/>
+                <w:lang w:bidi="fa-IR"/>
+              </w:rPr>
+              <w:t>بخش سوم ـ معرف</w:t>
+            </w:r>
+            <w:r>
+              <w:rPr>
+                <w:rStyle w:val="Hyperlink"/>
+                <w:rFonts w:hint="cs"/>
+                <w:noProof/>
+                <w:rtl/>
+                <w:lang w:bidi="fa-IR"/>
+              </w:rPr>
+              <w:t>ی</w:t>
+            </w:r>
+            <w:r>
+              <w:rPr>
+                <w:rStyle w:val="Hyperlink"/>
+                <w:noProof/>
+                <w:rtl/>
+                <w:lang w:bidi="fa-IR"/>
+              </w:rPr>
+              <w:t xml:space="preserve"> چند س</w:t>
+            </w:r>
+            <w:r>
+              <w:rPr>
+                <w:rStyle w:val="Hyperlink"/>
+                <w:rFonts w:hint="cs"/>
+                <w:noProof/>
+                <w:rtl/>
+                <w:lang w:bidi="fa-IR"/>
+              </w:rPr>
+              <w:t>ی</w:t>
+            </w:r>
+            <w:r>
+              <w:rPr>
+                <w:rStyle w:val="Hyperlink"/>
+                <w:rFonts w:hint="eastAsia"/>
+                <w:noProof/>
+                <w:rtl/>
+                <w:lang w:bidi="fa-IR"/>
+              </w:rPr>
+              <w:t>ستم</w:t>
+            </w:r>
+            <w:r>
+              <w:rPr>
+                <w:rStyle w:val="Hyperlink"/>
+                <w:noProof/>
+                <w:rtl/>
+                <w:lang w:bidi="fa-IR"/>
+              </w:rPr>
+              <w:t xml:space="preserve"> عامل</w:t>
+            </w:r>
+            <w:r>
+              <w:rPr>
+                <w:noProof/>
+                <w:webHidden/>
+              </w:rPr>
+              <w:tab/>
+            </w:r>
+            <w:r>
+              <w:rPr>
+                <w:noProof/>
+                <w:webHidden/>
+              </w:rPr>
+              <w:fldChar w:fldCharType="begin"/>
+            </w:r>
+            <w:r>
+              <w:rPr>
+                <w:noProof/>
+                <w:webHidden/>
+              </w:rPr>
+              <w:instrText xml:space="preserve"> PAGEREF _Toc212025652 \h </w:instrText>
+            </w:r>
+            <w:r>
+              <w:rPr>
+                <w:noProof/>
+                <w:webHidden/>
+              </w:rPr>
+            </w:r>
+            <w:r>
+              <w:rPr>
+                <w:noProof/>
+                <w:webHidden/>
+              </w:rPr>
+              <w:fldChar w:fldCharType="separate"/>
+            </w:r>
+            <w:r>
+              <w:rPr>
+                <w:noProof/>
+                <w:webHidden/>
+                <w:rtl/>
+              </w:rPr>
+              <w:t>13</w:t>
+            </w:r>
+            <w:r>
+              <w:rPr>
+                <w:noProof/>
+                <w:webHidden/>
+              </w:rPr>
+              <w:fldChar w:fldCharType="end"/>
+            </w:r>
+          </w:hyperlink>
+        </w:p>
+        <w:p>
+          <w:r>
+            <w:rPr>
+              <w:b/>
+              <w:bCs/>
+              <w:noProof/>
+            </w:rPr>
+            <w:fldChar w:fldCharType="end"/>
+          </w:r>
+        </w:p>
+      </w:sdtContent>
+    </w:sdt>
+    <w:p>
+      <w:pPr>
+        <w:bidi w:val="0"/>
+        <w:ind w:left="0"/>
+        <w:jc w:val="left"/>
+        <w:rPr>
+          <w:rFonts w:cs="B Titr"/>
+          <w:sz w:val="48"/>
+          <w:szCs w:val="48"/>
+          <w:rtl/>
+          <w:lang w:bidi="fa-IR"/>
+        </w:rPr>
+      </w:pPr>
+    </w:p>
+    <w:p>
+      <w:pPr>
+        <w:bidi w:val="0"/>
+        <w:ind w:left="0"/>
+        <w:jc w:val="left"/>
+        <w:rPr>
+          <w:rFonts w:asciiTheme="minorHAnsi" w:hAnsiTheme="minorHAnsi" w:cs="B Titr"/>
+          <w:sz w:val="48"/>
+          <w:szCs w:val="48"/>
+          <w:lang w:bidi="fa-IR"/>
+        </w:rPr>
+      </w:pPr>
+      <w:r>
+        <w:rPr>
+          <w:rFonts w:cs="B Titr"/>
+          <w:sz w:val="48"/>
+          <w:szCs w:val="48"/>
+          <w:rtl/>
+          <w:lang w:bidi="fa-IR"/>
+        </w:rPr>
+        <w:br w:type="page"/>
+      </w:r>
+    </w:p>
+    <w:p>
+      <w:pPr>
+        <w:pStyle w:val="Heading1"/>
+        <w:rPr>
+          <w:rtl/>
+          <w:lang w:bidi="fa-IR"/>
+        </w:rPr>
+      </w:pPr>
+      <w:bookmarkStart w:id="0" w:name="_Toc212025644"/>
       <w:r>
         <w:rPr>
           <w:rFonts w:hint="cs"/>
           <w:rtl/>
           <w:lang w:bidi="fa-IR"/>
         </w:rPr>
-        <w:t>ارائه سیستم</w:t>
-      </w:r>
-      <w:r>
-        <w:rPr>
-          <w:rtl/>
-          <w:lang w:bidi="fa-IR"/>
-        </w:rPr>
-        <w:softHyphen/>
-      </w:r>
+        <w:lastRenderedPageBreak/>
+        <w:t>فصل اول ـ وجود حیاتی به سیستم عامل</w:t>
+      </w:r>
+      <w:bookmarkEnd w:id="0"/>
+    </w:p>
+    <w:p>
+      <w:pPr>
+        <w:pStyle w:val="Heading2"/>
+        <w:rPr>
+          <w:rtl/>
+          <w:lang w:bidi="fa-IR"/>
+        </w:rPr>
+      </w:pPr>
+      <w:bookmarkStart w:id="1" w:name="_Toc212025645"/>
       <w:r>
         <w:rPr>
           <w:rFonts w:hint="cs"/>
           <w:rtl/>
           <w:lang w:bidi="fa-IR"/>
         </w:rPr>
-        <w:t>های عامل</w:t>
-      </w:r>
-    </w:p>
-    <w:p>
-      <w:pPr>
-        <w:ind w:left="0"/>
-        <w:jc w:val="left"/>
-        <w:rPr>
-          <w:rtl/>
-          <w:lang w:bidi="fa-IR"/>
-        </w:rPr>
-      </w:pPr>
-      <w:r>
-        <w:rPr>
-          <w:rFonts w:hint="cs"/>
-          <w:rtl/>
-          <w:lang w:bidi="fa-IR"/>
-        </w:rPr>
-        <w:t>فصل اول ـ وجود حیاتی به سیستم عامل</w:t>
-      </w:r>
-    </w:p>
-    <w:p>
-      <w:pPr>
-        <w:ind w:left="0"/>
-        <w:jc w:val="left"/>
-        <w:rPr>
-          <w:rtl/>
-          <w:lang w:bidi="fa-IR"/>
-        </w:rPr>
-      </w:pPr>
-      <w:r>
-        <w:rPr>
-          <w:rFonts w:hint="cs"/>
-          <w:rtl/>
-          <w:lang w:bidi="fa-IR"/>
-        </w:rPr>
         <w:t>بخش اول ـ مشکلات نبود سیستم عامل</w:t>
       </w:r>
+      <w:bookmarkEnd w:id="1"/>
     </w:p>
     <w:p>
       <w:pPr>
@@ -429,7 +1623,37 @@
           <w:rFonts w:asciiTheme="minorHAnsi" w:hAnsiTheme="minorHAnsi"/>
           <w:lang w:bidi="fa-IR"/>
         </w:rPr>
-        <w:t xml:space="preserve"> </w:t>
+        <w:t xml:space="preserve"> CPU </w:t>
+      </w:r>
+      <w:r>
+        <w:rPr>
+          <w:rFonts w:asciiTheme="minorHAnsi" w:hAnsiTheme="minorHAnsi"/>
+          <w:rtl/>
+        </w:rPr>
+        <w:t>یا دیسک به طور نامتعادل مورد استفاده قرار گیرند</w:t>
+      </w:r>
+      <w:r>
+        <w:rPr>
+          <w:rFonts w:asciiTheme="minorHAnsi" w:hAnsiTheme="minorHAnsi"/>
+          <w:lang w:bidi="fa-IR"/>
+        </w:rPr>
+        <w:t>.</w:t>
+      </w:r>
+      <w:r>
+        <w:rPr>
+          <w:rFonts w:asciiTheme="minorHAnsi" w:hAnsiTheme="minorHAnsi"/>
+          <w:rtl/>
+          <w:lang w:bidi="fa-IR"/>
+        </w:rPr>
+        <w:br/>
+      </w:r>
+      <w:r>
+        <w:rPr>
+          <w:rFonts w:asciiTheme="minorHAnsi" w:hAnsiTheme="minorHAnsi" w:hint="cs"/>
+          <w:rtl/>
+          <w:lang w:bidi="fa-IR"/>
+        </w:rPr>
+        <w:t xml:space="preserve">نتیجه نبود مدیریت </w:t>
       </w:r>
       <w:r>
         <w:rPr>
@@ -440,50 +1664,6 @@
       </w:r>
       <w:r>
         <w:rPr>
-          <w:rFonts w:asciiTheme="minorHAnsi" w:hAnsiTheme="minorHAnsi"/>
-          <w:lang w:bidi="fa-IR"/>
-        </w:rPr>
-        <w:t xml:space="preserve"> </w:t>
-      </w:r>
-      <w:r>
-        <w:rPr>
-          <w:rFonts w:asciiTheme="minorHAnsi" w:hAnsiTheme="minorHAnsi"/>
-          <w:rtl/>
-        </w:rPr>
-        <w:t>یا دیسک به طور نامتعادل مورد استفاده قرار گیرند</w:t>
-      </w:r>
-      <w:r>
-        <w:rPr>
-          <w:rFonts w:asciiTheme="minorHAnsi" w:hAnsiTheme="minorHAnsi"/>
-          <w:lang w:bidi="fa-IR"/>
-        </w:rPr>
-        <w:t>.</w:t>
-      </w:r>
-      <w:r>
-        <w:rPr>
-          <w:rFonts w:asciiTheme="minorHAnsi" w:hAnsiTheme="minorHAnsi"/>
-          <w:rtl/>
-          <w:lang w:bidi="fa-IR"/>
-        </w:rPr>
-        <w:br/>
-      </w:r>
-      <w:r>
-        <w:rPr>
-          <w:rFonts w:asciiTheme="minorHAnsi" w:hAnsiTheme="minorHAnsi" w:hint="cs"/>
-          <w:rtl/>
-          <w:lang w:bidi="fa-IR"/>
-        </w:rPr>
-        <w:t xml:space="preserve">نتیجه نبود مدیریت </w:t>
-      </w:r>
-      <w:r>
-        <w:rPr>
-          <w:rFonts w:asciiTheme="minorHAnsi" w:hAnsiTheme="minorHAnsi"/>
-          <w:lang w:bidi="fa-IR"/>
-        </w:rPr>
-        <w:t>CPU</w:t>
-      </w:r>
-      <w:r>
-        <w:rPr>
           <w:rFonts w:asciiTheme="minorHAnsi" w:hAnsiTheme="minorHAnsi" w:hint="cs"/>
           <w:rtl/>
           <w:lang w:bidi="fa-IR"/>
@@ -510,13 +1690,23 @@
           <w:lang w:bidi="fa-IR"/>
         </w:rPr>
       </w:pPr>
-      <w:r>
-        <w:rPr>
+      <w:bookmarkStart w:id="2" w:name="_Toc212025646"/>
+      <w:r>
+        <w:rPr>
+          <w:rStyle w:val="Heading2Char"/>
           <w:rFonts w:hint="cs"/>
           <w:rtl/>
-          <w:lang w:bidi="fa-IR"/>
-        </w:rPr>
-        <w:t>بخش دوم معرفی سیستم عامل:</w:t>
+        </w:rPr>
+        <w:t>بخش دوم معرفی سیستم عامل</w:t>
+      </w:r>
+      <w:bookmarkEnd w:id="2"/>
+      <w:r>
+        <w:rPr>
+          <w:rFonts w:hint="cs"/>
+          <w:rtl/>
+          <w:lang w:bidi="fa-IR"/>
+        </w:rPr>
+        <w:t>:</w:t>
       </w:r>
     </w:p>
     <w:p>
@@ -969,6 +2159,7 @@
         <w:jc w:val="left"/>
         <w:rPr>
           <w:rFonts w:asciiTheme="minorHAnsi" w:hAnsiTheme="minorHAnsi"/>
+          <w:rtl/>
           <w:lang w:bidi="fa-IR"/>
         </w:rPr>
       </w:pPr>
@@ -997,24 +2188,24 @@
           <w:lang w:bidi="fa-IR"/>
         </w:rPr>
       </w:pPr>
-    </w:p>
-    <w:p>
-      <w:pPr>
-        <w:ind w:left="0"/>
-        <w:jc w:val="left"/>
-        <w:rPr>
-          <w:rFonts w:asciiTheme="minorHAnsi" w:hAnsiTheme="minorHAnsi"/>
-          <w:rtl/>
-          <w:lang w:bidi="fa-IR"/>
-        </w:rPr>
-      </w:pPr>
-      <w:r>
-        <w:rPr>
-          <w:rFonts w:asciiTheme="minorHAnsi" w:hAnsiTheme="minorHAnsi" w:hint="cs"/>
-          <w:rtl/>
-          <w:lang w:bidi="fa-IR"/>
-        </w:rPr>
-        <w:t>بخش سوم تاریخچه سیستم عامل:</w:t>
+      <w:bookmarkStart w:id="3" w:name="_Toc212025647"/>
+      <w:r>
+        <w:rPr>
+          <w:rStyle w:val="Heading2Char"/>
+          <w:rFonts w:hint="cs"/>
+          <w:rtl/>
+        </w:rPr>
+        <w:lastRenderedPageBreak/>
+        <w:t>بخش سوم تاریخچه سیستم عامل</w:t>
+      </w:r>
+      <w:bookmarkEnd w:id="3"/>
+      <w:r>
+        <w:rPr>
+          <w:rFonts w:asciiTheme="minorHAnsi" w:hAnsiTheme="minorHAnsi" w:hint="cs"/>
+          <w:rtl/>
+          <w:lang w:bidi="fa-IR"/>
+        </w:rPr>
+        <w:t>:</w:t>
       </w:r>
     </w:p>
     <w:p>
@@ -1684,6 +2875,7 @@
           <w:rFonts w:asciiTheme="minorHAnsi" w:hAnsiTheme="minorHAnsi"/>
           <w:rtl/>
         </w:rPr>
+        <w:lastRenderedPageBreak/>
         <w:t xml:space="preserve">نسل سوم (دهه </w:t>
       </w:r>
       <w:r>
@@ -2609,7 +3801,6 @@
           <w:rFonts w:asciiTheme="minorHAnsi" w:hAnsiTheme="minorHAnsi"/>
           <w:rtl/>
         </w:rPr>
-        <w:lastRenderedPageBreak/>
         <w:t xml:space="preserve">گسترش سیستم‌عامل‌های متن‌باز مثل </w:t>
       </w:r>
       <w:r>
@@ -2637,6 +3828,7 @@
           <w:rFonts w:asciiTheme="minorHAnsi" w:hAnsiTheme="minorHAnsi"/>
           <w:rtl/>
         </w:rPr>
+        <w:lastRenderedPageBreak/>
         <w:t xml:space="preserve">ظهور سیستم‌عامل‌های موبایل مثل </w:t>
       </w:r>
       <w:r>
@@ -2827,12 +4019,6 @@
           <w:rtl/>
         </w:rPr>
         <w:br/>
-      </w:r>
-      <w:r>
-        <w:rPr>
-          <w:rFonts w:asciiTheme="minorHAnsi" w:hAnsiTheme="minorHAnsi"/>
-          <w:rtl/>
-        </w:rPr>
         <w:t xml:space="preserve">امروزه سیستم‌عامل‌ها فراتر از دستگاه شخصی رفته‌اند و در </w:t>
       </w:r>
       <w:r>
@@ -3137,7 +4323,7 @@
         <w:ind w:left="0"/>
         <w:jc w:val="left"/>
         <w:rPr>
-          <w:rFonts w:asciiTheme="minorHAnsi" w:hAnsiTheme="minorHAnsi" w:hint="cs"/>
+          <w:rFonts w:asciiTheme="minorHAnsi" w:hAnsiTheme="minorHAnsi"/>
           <w:rtl/>
         </w:rPr>
       </w:pPr>
@@ -3151,13 +4337,23 @@
           <w:lang w:bidi="fa-IR"/>
         </w:rPr>
       </w:pPr>
-      <w:r>
-        <w:rPr>
+      <w:bookmarkStart w:id="4" w:name="_Toc212025648"/>
+      <w:r>
+        <w:rPr>
+          <w:rStyle w:val="Heading2Char"/>
           <w:rFonts w:hint="cs"/>
           <w:rtl/>
-          <w:lang w:bidi="fa-IR"/>
-        </w:rPr>
-        <w:t>بخش چهارم وظایف سیستم عامل:</w:t>
+        </w:rPr>
+        <w:t>بخش چهارم وظایف سیستم عامل</w:t>
+      </w:r>
+      <w:bookmarkEnd w:id="4"/>
+      <w:r>
+        <w:rPr>
+          <w:rFonts w:hint="cs"/>
+          <w:rtl/>
+          <w:lang w:bidi="fa-IR"/>
+        </w:rPr>
+        <w:t>:</w:t>
       </w:r>
     </w:p>
     <w:p>
@@ -3842,38 +5038,74 @@
         <w:jc w:val="left"/>
         <w:rPr>
           <w:rFonts w:asciiTheme="minorHAnsi" w:hAnsiTheme="minorHAnsi"/>
+          <w:lang w:bidi="fa-IR"/>
+        </w:rPr>
+      </w:pPr>
+      <w:r>
+        <w:rPr>
+          <w:rFonts w:asciiTheme="minorHAnsi" w:hAnsiTheme="minorHAnsi"/>
           <w:b/>
           <w:bCs/>
-          <w:lang w:bidi="fa-IR"/>
-        </w:rPr>
-      </w:pPr>
+          <w:rtl/>
+        </w:rPr>
+        <w:t>مدیریت دستگاه‌ها</w:t>
+      </w:r>
       <w:r>
         <w:rPr>
           <w:rFonts w:asciiTheme="minorHAnsi" w:hAnsiTheme="minorHAnsi"/>
           <w:b/>
           <w:bCs/>
-          <w:rtl/>
-        </w:rPr>
-        <w:t>مدیریت دستگاه‌ها</w:t>
-      </w:r>
-      <w:r>
-        <w:rPr>
-          <w:rFonts w:asciiTheme="minorHAnsi" w:hAnsiTheme="minorHAnsi"/>
+          <w:lang w:bidi="fa-IR"/>
+        </w:rPr>
+        <w:t xml:space="preserve"> (Device Management)</w:t>
+      </w:r>
+      <w:r>
+        <w:rPr>
+          <w:rFonts w:asciiTheme="minorHAnsi" w:hAnsiTheme="minorHAnsi" w:hint="cs"/>
           <w:b/>
           <w:bCs/>
-          <w:lang w:bidi="fa-IR"/>
-        </w:rPr>
-        <w:t xml:space="preserve"> (Device Management)</w:t>
-      </w:r>
-      <w:r>
-        <w:rPr>
-          <w:rFonts w:asciiTheme="minorHAnsi" w:hAnsiTheme="minorHAnsi" w:hint="cs"/>
+          <w:rtl/>
+          <w:lang w:bidi="fa-IR"/>
+        </w:rPr>
+        <w:t>:</w:t>
+      </w:r>
+      <w:r>
+        <w:rPr>
+          <w:rFonts w:asciiTheme="minorHAnsi" w:hAnsiTheme="minorHAnsi"/>
           <w:b/>
           <w:bCs/>
           <w:rtl/>
           <w:lang w:bidi="fa-IR"/>
         </w:rPr>
-        <w:t>:</w:t>
+        <w:br/>
+      </w:r>
+      <w:r>
+        <w:rPr>
+          <w:rFonts w:asciiTheme="minorHAnsi" w:hAnsiTheme="minorHAnsi"/>
+          <w:rtl/>
+        </w:rPr>
+        <w:t>سیستم‌عامل رابط بین نرم‌افزار و سخت‌افزارهای جانبی است</w:t>
+      </w:r>
+      <w:r>
+        <w:rPr>
+          <w:rFonts w:asciiTheme="minorHAnsi" w:hAnsiTheme="minorHAnsi"/>
+          <w:lang w:bidi="fa-IR"/>
+        </w:rPr>
+        <w:t>.</w:t>
+      </w:r>
+      <w:r>
+        <w:rPr>
+          <w:rFonts w:asciiTheme="minorHAnsi" w:hAnsiTheme="minorHAnsi"/>
+          <w:lang w:bidi="fa-IR"/>
+        </w:rPr>
+        <w:br/>
+      </w:r>
+      <w:r>
+        <w:rPr>
+          <w:rFonts w:asciiTheme="minorHAnsi" w:hAnsiTheme="minorHAnsi"/>
+          <w:rtl/>
+        </w:rPr>
+        <w:t xml:space="preserve">برای هر دستگاه (مثل چاپگر، موس، صفحه‌کلید یا کارت صدا)، سیستم‌عامل </w:t>
       </w:r>
       <w:r>
         <w:rPr>
@@ -3881,77 +5113,51 @@
           <w:b/>
           <w:bCs/>
           <w:rtl/>
-          <w:lang w:bidi="fa-IR"/>
-        </w:rPr>
-        <w:br/>
-      </w:r>
-      <w:r>
-        <w:rPr>
-          <w:rFonts w:asciiTheme="minorHAnsi" w:hAnsiTheme="minorHAnsi"/>
-          <w:rtl/>
-        </w:rPr>
-        <w:t>سیستم‌عامل رابط بین نرم‌افزار و سخت‌افزارهای جانبی است</w:t>
-      </w:r>
-      <w:r>
-        <w:rPr>
-          <w:rFonts w:asciiTheme="minorHAnsi" w:hAnsiTheme="minorHAnsi"/>
-          <w:lang w:bidi="fa-IR"/>
-        </w:rPr>
-        <w:t>.</w:t>
-      </w:r>
-      <w:r>
-        <w:rPr>
-          <w:rFonts w:asciiTheme="minorHAnsi" w:hAnsiTheme="minorHAnsi"/>
-          <w:lang w:bidi="fa-IR"/>
-        </w:rPr>
-        <w:br/>
-      </w:r>
-      <w:r>
-        <w:rPr>
-          <w:rFonts w:asciiTheme="minorHAnsi" w:hAnsiTheme="minorHAnsi"/>
-          <w:rtl/>
-        </w:rPr>
-        <w:t xml:space="preserve">برای هر دستگاه (مثل چاپگر، موس، صفحه‌کلید یا کارت صدا)، سیستم‌عامل </w:t>
+        </w:rPr>
+        <w:t>درایور</w:t>
       </w:r>
       <w:r>
         <w:rPr>
           <w:rFonts w:asciiTheme="minorHAnsi" w:hAnsiTheme="minorHAnsi"/>
           <w:b/>
           <w:bCs/>
-          <w:rtl/>
-        </w:rPr>
-        <w:t>درایور</w:t>
-      </w:r>
-      <w:r>
+          <w:lang w:bidi="fa-IR"/>
+        </w:rPr>
+        <w:t xml:space="preserve"> (Driver)</w:t>
+      </w:r>
+      <w:r>
+        <w:rPr>
+          <w:rFonts w:asciiTheme="minorHAnsi" w:hAnsiTheme="minorHAnsi"/>
+          <w:lang w:bidi="fa-IR"/>
+        </w:rPr>
+        <w:t xml:space="preserve"> </w:t>
+      </w:r>
+      <w:r>
+        <w:rPr>
+          <w:rFonts w:asciiTheme="minorHAnsi" w:hAnsiTheme="minorHAnsi"/>
+          <w:rtl/>
+        </w:rPr>
+        <w:t>مربوطه را در اختیار دارد تا بتواند درخواست‌ها را ترجمه و به زبان سخت‌افزار ارسال کند</w:t>
+      </w:r>
+      <w:r>
+        <w:rPr>
+          <w:rFonts w:asciiTheme="minorHAnsi" w:hAnsiTheme="minorHAnsi"/>
+          <w:lang w:bidi="fa-IR"/>
+        </w:rPr>
+        <w:t>.</w:t>
+      </w:r>
+    </w:p>
+    <w:p>
+      <w:pPr>
+        <w:ind w:left="0"/>
+        <w:jc w:val="left"/>
         <w:rPr>
           <w:rFonts w:asciiTheme="minorHAnsi" w:hAnsiTheme="minorHAnsi"/>
           <w:b/>
           <w:bCs/>
           <w:lang w:bidi="fa-IR"/>
         </w:rPr>
-        <w:t xml:space="preserve"> (Driver)</w:t>
-      </w:r>
-      <w:r>
-        <w:rPr>
-          <w:rFonts w:asciiTheme="minorHAnsi" w:hAnsiTheme="minorHAnsi"/>
-          <w:lang w:bidi="fa-IR"/>
-        </w:rPr>
-        <w:t xml:space="preserve"> </w:t>
-      </w:r>
-      <w:r>
-        <w:rPr>
-          <w:rFonts w:asciiTheme="minorHAnsi" w:hAnsiTheme="minorHAnsi"/>
-          <w:rtl/>
-        </w:rPr>
-        <w:t>مربوطه را در اختیار دارد تا بتواند درخواست‌ها را ترجمه و به زبان سخت‌افزار ارسال کند</w:t>
-      </w:r>
-      <w:r>
-        <w:rPr>
-          <w:rFonts w:asciiTheme="minorHAnsi" w:hAnsiTheme="minorHAnsi"/>
-          <w:lang w:bidi="fa-IR"/>
-        </w:rPr>
-        <w:t>.</w:t>
-      </w:r>
+      </w:pPr>
     </w:p>
     <w:p>
       <w:pPr>
@@ -4484,16 +5690,2051 @@
     </w:p>
     <w:p>
       <w:pPr>
+        <w:bidi w:val="0"/>
         <w:ind w:left="0"/>
         <w:jc w:val="left"/>
         <w:rPr>
+          <w:rFonts w:asciiTheme="minorHAnsi" w:hAnsiTheme="minorHAnsi"/>
+          <w:rtl/>
+          <w:lang w:bidi="fa-IR"/>
+        </w:rPr>
+      </w:pPr>
+      <w:r>
+        <w:rPr>
+          <w:rFonts w:asciiTheme="minorHAnsi" w:hAnsiTheme="minorHAnsi"/>
+          <w:rtl/>
+          <w:lang w:bidi="fa-IR"/>
+        </w:rPr>
+        <w:br w:type="page"/>
+      </w:r>
+    </w:p>
+    <w:p>
+      <w:pPr>
+        <w:pStyle w:val="Heading1"/>
+        <w:rPr>
+          <w:rtl/>
+          <w:lang w:bidi="fa-IR"/>
+        </w:rPr>
+      </w:pPr>
+      <w:bookmarkStart w:id="5" w:name="_Toc212025649"/>
+      <w:r>
+        <w:rPr>
+          <w:rFonts w:hint="cs"/>
+          <w:rtl/>
+          <w:lang w:bidi="fa-IR"/>
+        </w:rPr>
+        <w:lastRenderedPageBreak/>
+        <w:t>فصل دوم ـ انواع ساختار سیستم عامل ها</w:t>
+      </w:r>
+      <w:bookmarkEnd w:id="5"/>
+      <w:r>
+        <w:rPr>
+          <w:rFonts w:hint="cs"/>
+          <w:rtl/>
+          <w:lang w:bidi="fa-IR"/>
+        </w:rPr>
+        <w:t xml:space="preserve"> </w:t>
+      </w:r>
+    </w:p>
+    <w:p>
+      <w:pPr>
+        <w:pStyle w:val="Heading2"/>
+        <w:rPr>
+          <w:rtl/>
+          <w:lang w:bidi="fa-IR"/>
+        </w:rPr>
+      </w:pPr>
+      <w:bookmarkStart w:id="6" w:name="_Toc212025650"/>
+      <w:r>
+        <w:rPr>
+          <w:rFonts w:hint="cs"/>
+          <w:rtl/>
+          <w:lang w:bidi="fa-IR"/>
+        </w:rPr>
+        <w:t>بخش اول ـ معرفی انواع سیستم عامل ها</w:t>
+      </w:r>
+      <w:bookmarkEnd w:id="6"/>
+    </w:p>
+    <w:p>
+      <w:pPr>
+        <w:ind w:left="0"/>
+        <w:jc w:val="left"/>
+        <w:rPr>
+          <w:rFonts w:asciiTheme="minorHAnsi" w:hAnsiTheme="minorHAnsi"/>
+          <w:rtl/>
+          <w:lang w:bidi="fa-IR"/>
+        </w:rPr>
+      </w:pPr>
+      <w:r>
+        <w:rPr>
+          <w:rFonts w:asciiTheme="minorHAnsi" w:hAnsiTheme="minorHAnsi" w:hint="cs"/>
+          <w:rtl/>
+          <w:lang w:bidi="fa-IR"/>
+        </w:rPr>
+        <w:t xml:space="preserve">دسته بندی های اصلی سیستم عامل ها بر اساس عملکرد و کاربرد به چند دسته تقسیم میشوند: </w:t>
+      </w:r>
+    </w:p>
+    <w:p>
+      <w:pPr>
+        <w:pStyle w:val="ListParagraph"/>
+        <w:numPr>
+          <w:ilvl w:val="0"/>
+          <w:numId w:val="16"/>
+        </w:numPr>
+        <w:jc w:val="left"/>
+        <w:rPr>
+          <w:rFonts w:asciiTheme="minorHAnsi" w:hAnsiTheme="minorHAnsi"/>
+          <w:lang w:bidi="fa-IR"/>
+        </w:rPr>
+      </w:pPr>
+      <w:r>
+        <w:rPr>
+          <w:rFonts w:asciiTheme="minorHAnsi" w:hAnsiTheme="minorHAnsi" w:hint="cs"/>
+          <w:rtl/>
+          <w:lang w:bidi="fa-IR"/>
+        </w:rPr>
+        <w:t>سیستم عامل های دسته ای (</w:t>
+      </w:r>
+      <w:r>
+        <w:rPr>
+          <w:rFonts w:asciiTheme="minorHAnsi" w:hAnsiTheme="minorHAnsi"/>
+          <w:lang w:bidi="fa-IR"/>
+        </w:rPr>
+        <w:t xml:space="preserve">batch </w:t>
+      </w:r>
+      <w:proofErr w:type="spellStart"/>
+      <w:r>
+        <w:rPr>
+          <w:rFonts w:asciiTheme="minorHAnsi" w:hAnsiTheme="minorHAnsi"/>
+          <w:lang w:bidi="fa-IR"/>
+        </w:rPr>
+        <w:t>os</w:t>
+      </w:r>
+      <w:proofErr w:type="spellEnd"/>
+      <w:r>
+        <w:rPr>
+          <w:rFonts w:asciiTheme="minorHAnsi" w:hAnsiTheme="minorHAnsi" w:hint="cs"/>
+          <w:rtl/>
+          <w:lang w:bidi="fa-IR"/>
+        </w:rPr>
+        <w:t>): برنامه ها به صورت گروهی و بدون تعامل با کاربر اجرا میشوند از ویژگی های این سیستم عامل میتوان به:</w:t>
+      </w:r>
+      <w:r>
+        <w:rPr>
+          <w:rFonts w:asciiTheme="minorHAnsi" w:hAnsiTheme="minorHAnsi"/>
+          <w:rtl/>
+          <w:lang w:bidi="fa-IR"/>
+        </w:rPr>
+        <w:br/>
+      </w:r>
+      <w:r>
+        <w:rPr>
+          <w:rFonts w:asciiTheme="minorHAnsi" w:hAnsiTheme="minorHAnsi" w:hint="cs"/>
+          <w:rtl/>
+          <w:lang w:bidi="fa-IR"/>
+        </w:rPr>
+        <w:t>۱- مناسب برای پردازش های طولانی و تکراری</w:t>
+      </w:r>
+      <w:r>
+        <w:rPr>
+          <w:rFonts w:asciiTheme="minorHAnsi" w:hAnsiTheme="minorHAnsi"/>
+          <w:rtl/>
+          <w:lang w:bidi="fa-IR"/>
+        </w:rPr>
+        <w:br/>
+      </w:r>
+      <w:r>
+        <w:rPr>
+          <w:rFonts w:asciiTheme="minorHAnsi" w:hAnsiTheme="minorHAnsi" w:hint="cs"/>
+          <w:rtl/>
+          <w:lang w:bidi="fa-IR"/>
+        </w:rPr>
+        <w:t>۲- فاقد رابط کاربری</w:t>
+      </w:r>
+      <w:r>
+        <w:rPr>
+          <w:rFonts w:asciiTheme="minorHAnsi" w:hAnsiTheme="minorHAnsi"/>
+          <w:rtl/>
+          <w:lang w:bidi="fa-IR"/>
+        </w:rPr>
+        <w:br/>
+      </w:r>
+      <w:r>
+        <w:rPr>
+          <w:rFonts w:asciiTheme="minorHAnsi" w:hAnsiTheme="minorHAnsi" w:hint="cs"/>
+          <w:rtl/>
+          <w:lang w:bidi="fa-IR"/>
+        </w:rPr>
+        <w:t xml:space="preserve">عمر این سیستم عامل ها از سال های ۱۹۶۰ تا ۱۹۷۲ ادامه داشته است و میتوان به سیستم عامل </w:t>
+      </w:r>
+      <w:r>
+        <w:rPr>
+          <w:rFonts w:asciiTheme="minorHAnsi" w:hAnsiTheme="minorHAnsi"/>
+          <w:lang w:bidi="fa-IR"/>
+        </w:rPr>
+        <w:t>IBM OS / 360</w:t>
+      </w:r>
+      <w:r>
+        <w:rPr>
+          <w:rFonts w:asciiTheme="minorHAnsi" w:hAnsiTheme="minorHAnsi" w:hint="cs"/>
+          <w:rtl/>
+          <w:lang w:bidi="fa-IR"/>
+        </w:rPr>
+        <w:t xml:space="preserve"> اشاره کرد.</w:t>
+      </w:r>
+    </w:p>
+    <w:p>
+      <w:pPr>
+        <w:pStyle w:val="ListParagraph"/>
+        <w:numPr>
+          <w:ilvl w:val="0"/>
+          <w:numId w:val="16"/>
+        </w:numPr>
+        <w:jc w:val="left"/>
+        <w:rPr>
+          <w:rFonts w:asciiTheme="minorHAnsi" w:hAnsiTheme="minorHAnsi"/>
+          <w:lang w:bidi="fa-IR"/>
+        </w:rPr>
+      </w:pPr>
+      <w:r>
+        <w:rPr>
+          <w:rFonts w:asciiTheme="minorHAnsi" w:hAnsiTheme="minorHAnsi" w:hint="cs"/>
+          <w:rtl/>
+          <w:lang w:bidi="fa-IR"/>
+        </w:rPr>
+        <w:t>سیستم عامل های اشتراک زمانی (</w:t>
+      </w:r>
+      <w:r>
+        <w:rPr>
+          <w:rFonts w:asciiTheme="minorHAnsi" w:hAnsiTheme="minorHAnsi"/>
+          <w:lang w:bidi="fa-IR"/>
+        </w:rPr>
+        <w:t xml:space="preserve">time sharing </w:t>
+      </w:r>
+      <w:proofErr w:type="spellStart"/>
+      <w:r>
+        <w:rPr>
+          <w:rFonts w:asciiTheme="minorHAnsi" w:hAnsiTheme="minorHAnsi"/>
+          <w:lang w:bidi="fa-IR"/>
+        </w:rPr>
+        <w:t>os</w:t>
+      </w:r>
+      <w:proofErr w:type="spellEnd"/>
+      <w:r>
+        <w:rPr>
+          <w:rFonts w:asciiTheme="minorHAnsi" w:hAnsiTheme="minorHAnsi" w:hint="cs"/>
+          <w:rtl/>
+          <w:lang w:bidi="fa-IR"/>
+        </w:rPr>
+        <w:t xml:space="preserve">): منابع سیستم بین چند کاربر به صورت همزمان تقسیم میشوند. ویژگی این سیستم این هست که هر کاربر احساس میکند که سیستم فقط برای خودش کار میکند و در این سیستم عامل ها از تکنیک های زمان بندی </w:t>
+      </w:r>
+      <w:r>
+        <w:rPr>
+          <w:rFonts w:asciiTheme="minorHAnsi" w:hAnsiTheme="minorHAnsi"/>
+          <w:lang w:bidi="fa-IR"/>
+        </w:rPr>
+        <w:t>CPU</w:t>
+      </w:r>
+      <w:r>
+        <w:rPr>
+          <w:rFonts w:asciiTheme="minorHAnsi" w:hAnsiTheme="minorHAnsi" w:hint="cs"/>
+          <w:rtl/>
+          <w:lang w:bidi="fa-IR"/>
+        </w:rPr>
+        <w:t xml:space="preserve"> استفاده میشود.</w:t>
+      </w:r>
+      <w:r>
+        <w:rPr>
+          <w:rFonts w:asciiTheme="minorHAnsi" w:hAnsiTheme="minorHAnsi"/>
+          <w:rtl/>
+          <w:lang w:bidi="fa-IR"/>
+        </w:rPr>
+        <w:br/>
+      </w:r>
+      <w:r>
+        <w:rPr>
+          <w:rFonts w:asciiTheme="minorHAnsi" w:hAnsiTheme="minorHAnsi" w:hint="cs"/>
+          <w:rtl/>
+          <w:lang w:bidi="fa-IR"/>
+        </w:rPr>
+        <w:t xml:space="preserve">از جمله این سیستم عامل ها میتوان به </w:t>
+      </w:r>
+      <w:r>
+        <w:rPr>
+          <w:rFonts w:asciiTheme="minorHAnsi" w:hAnsiTheme="minorHAnsi"/>
+          <w:lang w:bidi="fa-IR"/>
+        </w:rPr>
+        <w:t>UNIX</w:t>
+      </w:r>
+      <w:r>
+        <w:rPr>
+          <w:rFonts w:asciiTheme="minorHAnsi" w:hAnsiTheme="minorHAnsi" w:hint="cs"/>
+          <w:rtl/>
+          <w:lang w:bidi="fa-IR"/>
+        </w:rPr>
+        <w:t xml:space="preserve"> اشاره کرد. </w:t>
+      </w:r>
+      <w:r>
+        <w:rPr>
+          <w:rFonts w:asciiTheme="minorHAnsi" w:hAnsiTheme="minorHAnsi" w:hint="cs"/>
+          <w:rtl/>
+          <w:lang w:bidi="fa-IR"/>
+        </w:rPr>
+        <w:t>که بسیار در محیط های دانشگاهی و سرور های چند کاربره امروزی نیز استفاده میشود.</w:t>
+      </w:r>
+    </w:p>
+    <w:p>
+      <w:pPr>
+        <w:pStyle w:val="ListParagraph"/>
+        <w:numPr>
+          <w:ilvl w:val="0"/>
+          <w:numId w:val="16"/>
+        </w:numPr>
+        <w:jc w:val="left"/>
+        <w:rPr>
+          <w:rFonts w:asciiTheme="minorHAnsi" w:hAnsiTheme="minorHAnsi"/>
+          <w:lang w:bidi="fa-IR"/>
+        </w:rPr>
+      </w:pPr>
+      <w:r>
+        <w:rPr>
+          <w:rFonts w:asciiTheme="minorHAnsi" w:hAnsiTheme="minorHAnsi" w:hint="cs"/>
+          <w:rtl/>
+          <w:lang w:bidi="fa-IR"/>
+        </w:rPr>
+        <w:t>سیستم عامل همزمان (</w:t>
+      </w:r>
+      <w:r>
+        <w:rPr>
+          <w:rFonts w:asciiTheme="minorHAnsi" w:hAnsiTheme="minorHAnsi"/>
+          <w:lang w:bidi="fa-IR"/>
+        </w:rPr>
+        <w:t xml:space="preserve">real time </w:t>
+      </w:r>
+      <w:proofErr w:type="spellStart"/>
+      <w:r>
+        <w:rPr>
+          <w:rFonts w:asciiTheme="minorHAnsi" w:hAnsiTheme="minorHAnsi"/>
+          <w:lang w:bidi="fa-IR"/>
+        </w:rPr>
+        <w:t>os</w:t>
+      </w:r>
+      <w:proofErr w:type="spellEnd"/>
+      <w:r>
+        <w:rPr>
+          <w:rFonts w:asciiTheme="minorHAnsi" w:hAnsiTheme="minorHAnsi" w:hint="cs"/>
+          <w:rtl/>
+          <w:lang w:bidi="fa-IR"/>
+        </w:rPr>
+        <w:t>): پاسخ دهی سریع و قطعی به رویداد ها در زمان مشخص. از ویژگی های این دسته از سیستم عامل ها به زمان پاسخ دهی بسیار پایین میتوان اشاره کرد.</w:t>
+      </w:r>
+      <w:r>
+        <w:rPr>
+          <w:rFonts w:asciiTheme="minorHAnsi" w:hAnsiTheme="minorHAnsi"/>
+          <w:rtl/>
+          <w:lang w:bidi="fa-IR"/>
+        </w:rPr>
+        <w:br/>
+      </w:r>
+      <w:r>
+        <w:rPr>
+          <w:rFonts w:asciiTheme="minorHAnsi" w:hAnsiTheme="minorHAnsi" w:hint="cs"/>
+          <w:rtl/>
+          <w:lang w:bidi="fa-IR"/>
+        </w:rPr>
+        <w:t xml:space="preserve">این سیستم عامل ها بخاطر زمان پاسخ دهی بسیار پایین مناسب برای سیستم های تعبیه شده در صنایع است. از این دسته سیستم عامل ها میتوان به </w:t>
+      </w:r>
+      <w:proofErr w:type="spellStart"/>
+      <w:r>
+        <w:rPr>
+          <w:rFonts w:asciiTheme="minorHAnsi" w:hAnsiTheme="minorHAnsi"/>
+          <w:lang w:bidi="fa-IR"/>
+        </w:rPr>
+        <w:t>RTLinux</w:t>
+      </w:r>
+      <w:proofErr w:type="spellEnd"/>
+      <w:r>
+        <w:rPr>
+          <w:rFonts w:asciiTheme="minorHAnsi" w:hAnsiTheme="minorHAnsi" w:hint="cs"/>
+          <w:rtl/>
+          <w:lang w:bidi="fa-IR"/>
+        </w:rPr>
+        <w:t xml:space="preserve"> اشاره کرد.</w:t>
+      </w:r>
+    </w:p>
+    <w:p>
+      <w:pPr>
+        <w:pStyle w:val="ListParagraph"/>
+        <w:numPr>
+          <w:ilvl w:val="0"/>
+          <w:numId w:val="16"/>
+        </w:numPr>
+        <w:jc w:val="left"/>
+        <w:rPr>
+          <w:rFonts w:asciiTheme="minorHAnsi" w:hAnsiTheme="minorHAnsi"/>
+          <w:lang w:bidi="fa-IR"/>
+        </w:rPr>
+      </w:pPr>
+      <w:r>
+        <w:rPr>
+          <w:rFonts w:asciiTheme="minorHAnsi" w:hAnsiTheme="minorHAnsi" w:hint="cs"/>
+          <w:rtl/>
+          <w:lang w:bidi="fa-IR"/>
+        </w:rPr>
+        <w:t>سیستم عامل شبکه ای (</w:t>
+      </w:r>
+      <w:r>
+        <w:rPr>
+          <w:rFonts w:asciiTheme="minorHAnsi" w:hAnsiTheme="minorHAnsi"/>
+          <w:lang w:bidi="fa-IR"/>
+        </w:rPr>
+        <w:t xml:space="preserve">network </w:t>
+      </w:r>
+      <w:proofErr w:type="spellStart"/>
+      <w:r>
+        <w:rPr>
+          <w:rFonts w:asciiTheme="minorHAnsi" w:hAnsiTheme="minorHAnsi"/>
+          <w:lang w:bidi="fa-IR"/>
+        </w:rPr>
+        <w:t>os</w:t>
+      </w:r>
+      <w:proofErr w:type="spellEnd"/>
+      <w:r>
+        <w:rPr>
+          <w:rFonts w:asciiTheme="minorHAnsi" w:hAnsiTheme="minorHAnsi" w:hint="cs"/>
+          <w:rtl/>
+          <w:lang w:bidi="fa-IR"/>
+        </w:rPr>
+        <w:t>): مدیریت منابع و ارتباطات بین کامپیوتر های متصل به شبکه. دو ویژگی اصلی این دسته از سیستم عامل ها اشتراک گذاری فایل ها چاپگر ها و سایر منابع و امنیت و م دیریت کاربران است.</w:t>
+      </w:r>
+      <w:r>
+        <w:rPr>
+          <w:rFonts w:asciiTheme="minorHAnsi" w:hAnsiTheme="minorHAnsi"/>
+          <w:rtl/>
+          <w:lang w:bidi="fa-IR"/>
+        </w:rPr>
+        <w:br/>
+      </w:r>
+      <w:r>
+        <w:rPr>
+          <w:rFonts w:asciiTheme="minorHAnsi" w:hAnsiTheme="minorHAnsi" w:hint="cs"/>
+          <w:rtl/>
+          <w:lang w:bidi="fa-IR"/>
+        </w:rPr>
+        <w:t xml:space="preserve">از این دسته سیستم عامل ها میتوان به </w:t>
+      </w:r>
+      <w:proofErr w:type="spellStart"/>
+      <w:r>
+        <w:rPr>
+          <w:rFonts w:asciiTheme="minorHAnsi" w:hAnsiTheme="minorHAnsi"/>
+          <w:lang w:bidi="fa-IR"/>
+        </w:rPr>
+        <w:t>windos</w:t>
+      </w:r>
+      <w:proofErr w:type="spellEnd"/>
+      <w:r>
+        <w:rPr>
+          <w:rFonts w:asciiTheme="minorHAnsi" w:hAnsiTheme="minorHAnsi"/>
+          <w:lang w:bidi="fa-IR"/>
+        </w:rPr>
+        <w:t xml:space="preserve"> server</w:t>
+      </w:r>
+      <w:r>
+        <w:rPr>
+          <w:rFonts w:asciiTheme="minorHAnsi" w:hAnsiTheme="minorHAnsi" w:hint="cs"/>
+          <w:rtl/>
+          <w:lang w:bidi="fa-IR"/>
+        </w:rPr>
+        <w:t xml:space="preserve"> اشاره کرد که مناسب برای شرکت هایی با چند کامپیوتر متصل به هم هست. </w:t>
+      </w:r>
+    </w:p>
+    <w:p>
+      <w:pPr>
+        <w:pStyle w:val="ListParagraph"/>
+        <w:numPr>
+          <w:ilvl w:val="0"/>
+          <w:numId w:val="16"/>
+        </w:numPr>
+        <w:jc w:val="left"/>
+        <w:rPr>
+          <w:rFonts w:asciiTheme="minorHAnsi" w:hAnsiTheme="minorHAnsi"/>
+          <w:lang w:bidi="fa-IR"/>
+        </w:rPr>
+      </w:pPr>
+      <w:r>
+        <w:rPr>
+          <w:rFonts w:asciiTheme="minorHAnsi" w:hAnsiTheme="minorHAnsi" w:hint="cs"/>
+          <w:rtl/>
+          <w:lang w:bidi="fa-IR"/>
+        </w:rPr>
+        <w:lastRenderedPageBreak/>
+        <w:t>سیستم عامل های توزیع شده(</w:t>
+      </w:r>
+      <w:r>
+        <w:rPr>
+          <w:rFonts w:asciiTheme="minorHAnsi" w:hAnsiTheme="minorHAnsi"/>
+          <w:lang w:bidi="fa-IR"/>
+        </w:rPr>
+        <w:t>Distributed</w:t>
+      </w:r>
+      <w:r>
+        <w:rPr>
+          <w:rFonts w:asciiTheme="minorHAnsi" w:hAnsiTheme="minorHAnsi"/>
+          <w:lang w:bidi="fa-IR"/>
+        </w:rPr>
+        <w:t xml:space="preserve"> </w:t>
+      </w:r>
+      <w:proofErr w:type="spellStart"/>
+      <w:r>
+        <w:rPr>
+          <w:rFonts w:asciiTheme="minorHAnsi" w:hAnsiTheme="minorHAnsi"/>
+          <w:lang w:bidi="fa-IR"/>
+        </w:rPr>
+        <w:t>os</w:t>
+      </w:r>
+      <w:proofErr w:type="spellEnd"/>
+      <w:r>
+        <w:rPr>
+          <w:rFonts w:asciiTheme="minorHAnsi" w:hAnsiTheme="minorHAnsi" w:hint="cs"/>
+          <w:rtl/>
+          <w:lang w:bidi="fa-IR"/>
+        </w:rPr>
+        <w:t xml:space="preserve">): این دسته از سیستم عامل ها برعکس سیستم عامل های اشتراک زمانی </w:t>
+      </w:r>
+      <w:r>
+        <w:rPr>
+          <w:rFonts w:asciiTheme="minorHAnsi" w:hAnsiTheme="minorHAnsi" w:hint="cs"/>
+          <w:rtl/>
+          <w:lang w:bidi="fa-IR"/>
+        </w:rPr>
+        <w:t xml:space="preserve">عمل میکنند یعنی از کامپیوتر برای انجام عملیات به صورت موازی استفاده میکند. مانند سیستم عامل </w:t>
+      </w:r>
+      <w:r>
+        <w:rPr>
+          <w:rFonts w:asciiTheme="minorHAnsi" w:hAnsiTheme="minorHAnsi"/>
+          <w:lang w:bidi="fa-IR"/>
+        </w:rPr>
+        <w:t>amoeba, plan 9</w:t>
+      </w:r>
+      <w:r>
+        <w:rPr>
+          <w:rFonts w:asciiTheme="minorHAnsi" w:hAnsiTheme="minorHAnsi" w:hint="cs"/>
+          <w:rtl/>
+          <w:lang w:bidi="fa-IR"/>
+        </w:rPr>
+        <w:t xml:space="preserve"> که در مراکز داده و پردازش های سنگین استفاده میشود.</w:t>
+      </w:r>
+    </w:p>
+    <w:p>
+      <w:pPr>
+        <w:pStyle w:val="ListParagraph"/>
+        <w:numPr>
+          <w:ilvl w:val="0"/>
+          <w:numId w:val="16"/>
+        </w:numPr>
+        <w:jc w:val="left"/>
+        <w:rPr>
+          <w:rFonts w:asciiTheme="minorHAnsi" w:hAnsiTheme="minorHAnsi"/>
+          <w:lang w:bidi="fa-IR"/>
+        </w:rPr>
+      </w:pPr>
+      <w:r>
+        <w:rPr>
+          <w:rFonts w:asciiTheme="minorHAnsi" w:hAnsiTheme="minorHAnsi" w:hint="cs"/>
+          <w:rtl/>
+          <w:lang w:bidi="fa-IR"/>
+        </w:rPr>
+        <w:t>سیستم عامل های موبایل (</w:t>
+      </w:r>
+      <w:r>
+        <w:rPr>
+          <w:rFonts w:asciiTheme="minorHAnsi" w:hAnsiTheme="minorHAnsi"/>
+          <w:lang w:bidi="fa-IR"/>
+        </w:rPr>
+        <w:t xml:space="preserve">mobile </w:t>
+      </w:r>
+      <w:proofErr w:type="spellStart"/>
+      <w:r>
+        <w:rPr>
+          <w:rFonts w:asciiTheme="minorHAnsi" w:hAnsiTheme="minorHAnsi"/>
+          <w:lang w:bidi="fa-IR"/>
+        </w:rPr>
+        <w:t>os</w:t>
+      </w:r>
+      <w:proofErr w:type="spellEnd"/>
+      <w:r>
+        <w:rPr>
+          <w:rFonts w:asciiTheme="minorHAnsi" w:hAnsiTheme="minorHAnsi" w:hint="cs"/>
+          <w:rtl/>
+          <w:lang w:bidi="fa-IR"/>
+        </w:rPr>
+        <w:t xml:space="preserve">): سیستم عامل هایی هستند که برای دستگاه های همراه طراحی شده اند که تلاش بر مصرف بهینه باطری دارند و از رابط کاربری لمسی پشتیبانی میکنند، مانند </w:t>
+      </w:r>
+      <w:r>
+        <w:rPr>
+          <w:rFonts w:asciiTheme="minorHAnsi" w:hAnsiTheme="minorHAnsi"/>
+          <w:lang w:bidi="fa-IR"/>
+        </w:rPr>
+        <w:t xml:space="preserve">android, </w:t>
+      </w:r>
+      <w:proofErr w:type="spellStart"/>
+      <w:r>
+        <w:rPr>
+          <w:rFonts w:asciiTheme="minorHAnsi" w:hAnsiTheme="minorHAnsi"/>
+          <w:lang w:bidi="fa-IR"/>
+        </w:rPr>
+        <w:t>ios</w:t>
+      </w:r>
+      <w:proofErr w:type="spellEnd"/>
+      <w:r>
+        <w:rPr>
+          <w:rFonts w:asciiTheme="minorHAnsi" w:hAnsiTheme="minorHAnsi" w:hint="cs"/>
+          <w:rtl/>
+          <w:lang w:bidi="fa-IR"/>
+        </w:rPr>
+        <w:t>.</w:t>
+      </w:r>
+    </w:p>
+    <w:p>
+      <w:pPr>
+        <w:pStyle w:val="Heading2"/>
+        <w:rPr>
+          <w:rtl/>
+          <w:lang w:bidi="fa-IR"/>
+        </w:rPr>
+      </w:pPr>
+      <w:bookmarkStart w:id="7" w:name="_Toc212025651"/>
+      <w:r>
+        <w:rPr>
+          <w:rFonts w:hint="cs"/>
+          <w:rtl/>
+          <w:lang w:bidi="fa-IR"/>
+        </w:rPr>
+        <w:t>بخش دوم ـ ساختار های سیستم عامل ها</w:t>
+      </w:r>
+      <w:bookmarkEnd w:id="7"/>
+    </w:p>
+    <w:p>
+      <w:pPr>
+        <w:ind w:left="0"/>
+        <w:jc w:val="left"/>
+        <w:rPr>
+          <w:rFonts w:asciiTheme="minorHAnsi" w:hAnsiTheme="minorHAnsi"/>
+          <w:rtl/>
+          <w:lang w:bidi="fa-IR"/>
+        </w:rPr>
+      </w:pPr>
+      <w:r>
+        <w:rPr>
+          <w:rFonts w:asciiTheme="minorHAnsi" w:hAnsiTheme="minorHAnsi"/>
+          <w:rtl/>
+        </w:rPr>
+        <w:t>ساختارهای سیستم‌عامل شامل مدل‌های مختلفی هستند که نحوه سازمان‌دهی اجزای سیستم‌عامل را مشخص می‌کنند. مهم‌ترین آن‌ها عبارت‌اند از</w:t>
+      </w:r>
+      <w:r>
+        <w:rPr>
+          <w:rFonts w:asciiTheme="minorHAnsi" w:hAnsiTheme="minorHAnsi"/>
+          <w:lang w:bidi="fa-IR"/>
+        </w:rPr>
+        <w:t>:</w:t>
+      </w:r>
+    </w:p>
+    <w:p>
+      <w:pPr>
+        <w:pStyle w:val="ListParagraph"/>
+        <w:numPr>
+          <w:ilvl w:val="0"/>
+          <w:numId w:val="17"/>
+        </w:numPr>
+        <w:jc w:val="left"/>
+        <w:rPr>
+          <w:rFonts w:asciiTheme="minorHAnsi" w:hAnsiTheme="minorHAnsi"/>
+          <w:lang w:bidi="fa-IR"/>
+        </w:rPr>
+      </w:pPr>
+      <w:r>
+        <w:rPr>
+          <w:rFonts w:asciiTheme="minorHAnsi" w:hAnsiTheme="minorHAnsi" w:hint="cs"/>
+          <w:rtl/>
+          <w:lang w:bidi="fa-IR"/>
+        </w:rPr>
+        <w:t>ساختار یکپارچه:‌ همه اجزای سیستم عامل در یک بلوک بزرگ و واحد قرار دارد و همه سرویس ها مانند مدیریت حافظه، فایل و زمان بندی در یک سطح انجام میشه.</w:t>
+      </w:r>
+      <w:r>
+        <w:rPr>
+          <w:rFonts w:asciiTheme="minorHAnsi" w:hAnsiTheme="minorHAnsi"/>
+          <w:rtl/>
+          <w:lang w:bidi="fa-IR"/>
+        </w:rPr>
+        <w:br/>
+      </w:r>
+      <w:r>
+        <w:rPr>
+          <w:rFonts w:asciiTheme="minorHAnsi" w:hAnsiTheme="minorHAnsi" w:hint="cs"/>
+          <w:rtl/>
+          <w:lang w:bidi="fa-IR"/>
+        </w:rPr>
+        <w:t>مزایا:‌ سرعت بالا و پیاده سازی آسان</w:t>
+      </w:r>
+      <w:r>
+        <w:rPr>
+          <w:rFonts w:asciiTheme="minorHAnsi" w:hAnsiTheme="minorHAnsi"/>
+          <w:rtl/>
+          <w:lang w:bidi="fa-IR"/>
+        </w:rPr>
+        <w:br/>
+      </w:r>
+      <w:r>
+        <w:rPr>
+          <w:rFonts w:asciiTheme="minorHAnsi" w:hAnsiTheme="minorHAnsi" w:hint="cs"/>
+          <w:rtl/>
+          <w:lang w:bidi="fa-IR"/>
+        </w:rPr>
+        <w:t>معایب:‌ نگهداری و توسعه دشوار و امنیت پایین</w:t>
+      </w:r>
+      <w:r>
+        <w:rPr>
+          <w:rFonts w:asciiTheme="minorHAnsi" w:hAnsiTheme="minorHAnsi"/>
+          <w:rtl/>
+          <w:lang w:bidi="fa-IR"/>
+        </w:rPr>
+        <w:br/>
+      </w:r>
+      <w:r>
+        <w:rPr>
+          <w:rFonts w:asciiTheme="minorHAnsi" w:hAnsiTheme="minorHAnsi" w:hint="cs"/>
+          <w:rtl/>
+          <w:lang w:bidi="fa-IR"/>
+        </w:rPr>
+        <w:t xml:space="preserve">مثال: </w:t>
+      </w:r>
+      <w:r>
+        <w:rPr>
+          <w:rFonts w:asciiTheme="minorHAnsi" w:hAnsiTheme="minorHAnsi" w:hint="cs"/>
+          <w:rtl/>
+          <w:lang w:bidi="fa-IR"/>
+        </w:rPr>
+        <w:t xml:space="preserve">نسخه های اولیه </w:t>
+      </w:r>
+      <w:r>
+        <w:rPr>
+          <w:rFonts w:asciiTheme="minorHAnsi" w:hAnsiTheme="minorHAnsi"/>
+          <w:lang w:bidi="fa-IR"/>
+        </w:rPr>
+        <w:t>UNIX</w:t>
+      </w:r>
+    </w:p>
+    <w:p>
+      <w:pPr>
+        <w:pStyle w:val="ListParagraph"/>
+        <w:numPr>
+          <w:ilvl w:val="0"/>
+          <w:numId w:val="17"/>
+        </w:numPr>
+        <w:jc w:val="left"/>
+        <w:rPr>
+          <w:rFonts w:asciiTheme="minorHAnsi" w:hAnsiTheme="minorHAnsi"/>
+          <w:lang w:bidi="fa-IR"/>
+        </w:rPr>
+      </w:pPr>
+      <w:r>
+        <w:rPr>
+          <w:rFonts w:asciiTheme="minorHAnsi" w:hAnsiTheme="minorHAnsi" w:hint="cs"/>
+          <w:rtl/>
+          <w:lang w:bidi="fa-IR"/>
+        </w:rPr>
+        <w:t xml:space="preserve">ساختار لایه ای:‌ سیستم عامل به چند لایه تقسیم میشه که هر لایه فقط با لایه مجاور خودش در ارتباط. وظیفه هر لایه میتواند </w:t>
+      </w:r>
+      <w:r>
+        <w:rPr>
+          <w:rFonts w:asciiTheme="minorHAnsi" w:hAnsiTheme="minorHAnsi" w:hint="cs"/>
+          <w:rtl/>
+          <w:lang w:bidi="fa-IR"/>
+        </w:rPr>
+        <w:t>مدیریت حافظه، فایل ها و ورودی و خروجی ها باشد. در این ساختار لایه های پایین تر به سخت افزار نزدیک تر هستند.</w:t>
+      </w:r>
+      <w:r>
+        <w:rPr>
+          <w:rFonts w:asciiTheme="minorHAnsi" w:hAnsiTheme="minorHAnsi"/>
+          <w:rtl/>
+          <w:lang w:bidi="fa-IR"/>
+        </w:rPr>
+        <w:br/>
+      </w:r>
+      <w:r>
+        <w:rPr>
+          <w:rFonts w:asciiTheme="minorHAnsi" w:hAnsiTheme="minorHAnsi" w:hint="cs"/>
+          <w:rtl/>
+          <w:lang w:bidi="fa-IR"/>
+        </w:rPr>
+        <w:t>مزایا:‌ سازماندهی منظم تر و توسعه آسانتر</w:t>
+      </w:r>
+      <w:r>
+        <w:rPr>
+          <w:rFonts w:asciiTheme="minorHAnsi" w:hAnsiTheme="minorHAnsi"/>
+          <w:rtl/>
+          <w:lang w:bidi="fa-IR"/>
+        </w:rPr>
+        <w:br/>
+      </w:r>
+      <w:r>
+        <w:rPr>
+          <w:rFonts w:asciiTheme="minorHAnsi" w:hAnsiTheme="minorHAnsi" w:hint="cs"/>
+          <w:rtl/>
+          <w:lang w:bidi="fa-IR"/>
+        </w:rPr>
+        <w:t>معایب:‌ کاهش کارایی بخاطر عبور از چند لایه</w:t>
+      </w:r>
+      <w:r>
+        <w:rPr>
+          <w:rFonts w:asciiTheme="minorHAnsi" w:hAnsiTheme="minorHAnsi"/>
+          <w:rtl/>
+          <w:lang w:bidi="fa-IR"/>
+        </w:rPr>
+        <w:br/>
+      </w:r>
+      <w:r>
+        <w:rPr>
+          <w:rFonts w:asciiTheme="minorHAnsi" w:hAnsiTheme="minorHAnsi" w:hint="cs"/>
+          <w:rtl/>
+          <w:lang w:bidi="fa-IR"/>
+        </w:rPr>
+        <w:t>مثال:‌</w:t>
+      </w:r>
+      <w:r>
+        <w:rPr>
+          <w:rFonts w:asciiTheme="minorHAnsi" w:hAnsiTheme="minorHAnsi"/>
+          <w:lang w:bidi="fa-IR"/>
+        </w:rPr>
+        <w:t xml:space="preserve">  the operating system</w:t>
+      </w:r>
+    </w:p>
+    <w:p>
+      <w:pPr>
+        <w:pStyle w:val="ListParagraph"/>
+        <w:numPr>
+          <w:ilvl w:val="0"/>
+          <w:numId w:val="17"/>
+        </w:numPr>
+        <w:jc w:val="left"/>
+        <w:rPr>
+          <w:rFonts w:asciiTheme="minorHAnsi" w:hAnsiTheme="minorHAnsi"/>
+          <w:lang w:bidi="fa-IR"/>
+        </w:rPr>
+      </w:pPr>
+      <w:r>
+        <w:rPr>
+          <w:rFonts w:asciiTheme="minorHAnsi" w:hAnsiTheme="minorHAnsi" w:hint="cs"/>
+          <w:rtl/>
+          <w:lang w:bidi="fa-IR"/>
+        </w:rPr>
+        <w:t>ساختار میکروکرنل: فقط اجزای اصلی مثل زمانبندی و ارتباط بین فرآیند ها در کرنل قرار دارند و بقیه سرویس ها در فضای کاربر انجام میشود. از ساختار باعث میشود که کرنل بسیار کوچک و سبک شود و سرویس ها مثل مدیریت فایل و حافظه به صورت چداگانه اجرا شوند.</w:t>
+      </w:r>
+      <w:r>
+        <w:rPr>
+          <w:rFonts w:asciiTheme="minorHAnsi" w:hAnsiTheme="minorHAnsi"/>
+          <w:rtl/>
+          <w:lang w:bidi="fa-IR"/>
+        </w:rPr>
+        <w:br/>
+      </w:r>
+      <w:r>
+        <w:rPr>
+          <w:rFonts w:asciiTheme="minorHAnsi" w:hAnsiTheme="minorHAnsi" w:hint="cs"/>
+          <w:rtl/>
+          <w:lang w:bidi="fa-IR"/>
+        </w:rPr>
+        <w:t>مزایا:‌ امنیت بالا، قابلیت حمل بهتر</w:t>
+      </w:r>
+      <w:r>
+        <w:rPr>
+          <w:rFonts w:asciiTheme="minorHAnsi" w:hAnsiTheme="minorHAnsi"/>
+          <w:rtl/>
+          <w:lang w:bidi="fa-IR"/>
+        </w:rPr>
+        <w:br/>
+      </w:r>
+      <w:r>
+        <w:rPr>
+          <w:rFonts w:asciiTheme="minorHAnsi" w:hAnsiTheme="minorHAnsi" w:hint="cs"/>
+          <w:rtl/>
+          <w:lang w:bidi="fa-IR"/>
+        </w:rPr>
+        <w:t>معایب:‌ پیچیدگی در طراحی، کاهش سرعت بخاطر ارتباط بین اجزا</w:t>
+      </w:r>
+      <w:r>
+        <w:rPr>
+          <w:rFonts w:asciiTheme="minorHAnsi" w:hAnsiTheme="minorHAnsi"/>
+          <w:rtl/>
+          <w:lang w:bidi="fa-IR"/>
+        </w:rPr>
+        <w:br/>
+      </w:r>
+      <w:r>
+        <w:rPr>
+          <w:rFonts w:asciiTheme="minorHAnsi" w:hAnsiTheme="minorHAnsi" w:hint="cs"/>
+          <w:rtl/>
+          <w:lang w:bidi="fa-IR"/>
+        </w:rPr>
+        <w:t xml:space="preserve">مثال: </w:t>
+      </w:r>
+      <w:r>
+        <w:rPr>
+          <w:rFonts w:asciiTheme="minorHAnsi" w:hAnsiTheme="minorHAnsi"/>
+          <w:lang w:bidi="fa-IR"/>
+        </w:rPr>
+        <w:t>MINIX, QNX</w:t>
+      </w:r>
+    </w:p>
+    <w:p>
+      <w:pPr>
+        <w:pStyle w:val="ListParagraph"/>
+        <w:numPr>
+          <w:ilvl w:val="0"/>
+          <w:numId w:val="17"/>
+        </w:numPr>
+        <w:jc w:val="left"/>
+        <w:rPr>
+          <w:rFonts w:asciiTheme="minorHAnsi" w:hAnsiTheme="minorHAnsi"/>
+          <w:lang w:bidi="fa-IR"/>
+        </w:rPr>
+      </w:pPr>
+      <w:r>
+        <w:rPr>
+          <w:rFonts w:asciiTheme="minorHAnsi" w:hAnsiTheme="minorHAnsi" w:hint="cs"/>
+          <w:rtl/>
+          <w:lang w:bidi="fa-IR"/>
+        </w:rPr>
+        <w:lastRenderedPageBreak/>
+        <w:t xml:space="preserve">مدل مشتری / خدمت گزار: اجزای سیستم عامل به صورت سرویس دهنده و سرویس گیرنده طراحی شدند </w:t>
+      </w:r>
+      <w:r>
+        <w:rPr>
+          <w:rFonts w:asciiTheme="minorHAnsi" w:hAnsiTheme="minorHAnsi" w:hint="cs"/>
+          <w:rtl/>
+          <w:lang w:bidi="fa-IR"/>
+        </w:rPr>
+        <w:t>که این به این معناست که دو سرویس مثل فایل سیستم و شبکه به صورت مستقل اجرا شوند. و ارتباط اجزا مانند پیام انجام میشود.</w:t>
+      </w:r>
+      <w:r>
+        <w:rPr>
+          <w:rFonts w:asciiTheme="minorHAnsi" w:hAnsiTheme="minorHAnsi"/>
+          <w:rtl/>
+          <w:lang w:bidi="fa-IR"/>
+        </w:rPr>
+        <w:br/>
+      </w:r>
+      <w:r>
+        <w:rPr>
+          <w:rFonts w:asciiTheme="minorHAnsi" w:hAnsiTheme="minorHAnsi" w:hint="cs"/>
+          <w:rtl/>
+          <w:lang w:bidi="fa-IR"/>
+        </w:rPr>
+        <w:t>مزایا: انعطاف پذیری بالا، توسعه آسان</w:t>
+      </w:r>
+      <w:r>
+        <w:rPr>
+          <w:rFonts w:asciiTheme="minorHAnsi" w:hAnsiTheme="minorHAnsi"/>
+          <w:rtl/>
+          <w:lang w:bidi="fa-IR"/>
+        </w:rPr>
+        <w:br/>
+      </w:r>
+      <w:r>
+        <w:rPr>
+          <w:rFonts w:asciiTheme="minorHAnsi" w:hAnsiTheme="minorHAnsi" w:hint="cs"/>
+          <w:rtl/>
+          <w:lang w:bidi="fa-IR"/>
+        </w:rPr>
+        <w:t>معایب: تاخیر در ارتباط، پیچیدگی در هماهنگی</w:t>
+      </w:r>
+      <w:r>
+        <w:rPr>
+          <w:rFonts w:asciiTheme="minorHAnsi" w:hAnsiTheme="minorHAnsi"/>
+          <w:rtl/>
+          <w:lang w:bidi="fa-IR"/>
+        </w:rPr>
+        <w:br/>
+      </w:r>
+      <w:r>
+        <w:rPr>
+          <w:rFonts w:asciiTheme="minorHAnsi" w:hAnsiTheme="minorHAnsi" w:hint="cs"/>
+          <w:rtl/>
+          <w:lang w:bidi="fa-IR"/>
+        </w:rPr>
+        <w:t xml:space="preserve">مثال: </w:t>
+      </w:r>
+      <w:r>
+        <w:rPr>
+          <w:rFonts w:asciiTheme="minorHAnsi" w:hAnsiTheme="minorHAnsi"/>
+          <w:lang w:bidi="fa-IR"/>
+        </w:rPr>
+        <w:t xml:space="preserve">windows </w:t>
+      </w:r>
+      <w:proofErr w:type="spellStart"/>
+      <w:r>
+        <w:rPr>
+          <w:rFonts w:asciiTheme="minorHAnsi" w:hAnsiTheme="minorHAnsi"/>
+          <w:lang w:bidi="fa-IR"/>
+        </w:rPr>
+        <w:t>nt</w:t>
+      </w:r>
+      <w:proofErr w:type="spellEnd"/>
+    </w:p>
+    <w:p>
+      <w:pPr>
+        <w:pStyle w:val="ListParagraph"/>
+        <w:numPr>
+          <w:ilvl w:val="0"/>
+          <w:numId w:val="17"/>
+        </w:numPr>
+        <w:jc w:val="left"/>
+        <w:rPr>
+          <w:rFonts w:asciiTheme="minorHAnsi" w:hAnsiTheme="minorHAnsi"/>
+          <w:lang w:bidi="fa-IR"/>
+        </w:rPr>
+      </w:pPr>
+      <w:r>
+        <w:rPr>
+          <w:rFonts w:asciiTheme="minorHAnsi" w:hAnsiTheme="minorHAnsi" w:hint="cs"/>
+          <w:rtl/>
+          <w:lang w:bidi="fa-IR"/>
+        </w:rPr>
+        <w:t xml:space="preserve">ماشین مجازی:‌ </w:t>
+      </w:r>
+      <w:r>
+        <w:rPr>
+          <w:rFonts w:asciiTheme="minorHAnsi" w:hAnsiTheme="minorHAnsi"/>
+          <w:rtl/>
+        </w:rPr>
+        <w:t>سیستم‌عامل یک محیط مجازی برای اجرای چند سیستم‌عامل یا برنامه مستقل فراهم می‌کن</w:t>
+      </w:r>
+      <w:r>
+        <w:rPr>
+          <w:rFonts w:asciiTheme="minorHAnsi" w:hAnsiTheme="minorHAnsi" w:hint="cs"/>
+          <w:rtl/>
+        </w:rPr>
+        <w:t>د. در این ساختار هر ماشین مجازی مثل یک کامپیوتر مستقل عمل میکند و منابع بین ماشین ها به اشترا گذاشته میشود.</w:t>
+      </w:r>
+      <w:r>
+        <w:rPr>
+          <w:rFonts w:asciiTheme="minorHAnsi" w:hAnsiTheme="minorHAnsi"/>
+          <w:rtl/>
+        </w:rPr>
+        <w:br/>
+      </w:r>
+      <w:r>
+        <w:rPr>
+          <w:rFonts w:asciiTheme="minorHAnsi" w:hAnsiTheme="minorHAnsi" w:hint="cs"/>
+          <w:rtl/>
+        </w:rPr>
+        <w:t>مزایا: ایزوله سازی، تست و توسعه امن</w:t>
+      </w:r>
+      <w:r>
+        <w:rPr>
+          <w:rFonts w:asciiTheme="minorHAnsi" w:hAnsiTheme="minorHAnsi"/>
+          <w:rtl/>
+        </w:rPr>
+        <w:br/>
+      </w:r>
+      <w:r>
+        <w:rPr>
+          <w:rFonts w:asciiTheme="minorHAnsi" w:hAnsiTheme="minorHAnsi" w:hint="cs"/>
+          <w:rtl/>
+        </w:rPr>
+        <w:t>معایب:‌ مصرف منابع بالا</w:t>
+      </w:r>
+      <w:r>
+        <w:rPr>
+          <w:rFonts w:asciiTheme="minorHAnsi" w:hAnsiTheme="minorHAnsi"/>
+          <w:rtl/>
+        </w:rPr>
+        <w:br/>
+      </w:r>
+      <w:r>
+        <w:rPr>
+          <w:rFonts w:asciiTheme="minorHAnsi" w:hAnsiTheme="minorHAnsi" w:hint="cs"/>
+          <w:rtl/>
+        </w:rPr>
+        <w:t xml:space="preserve">مثل:‌ </w:t>
+      </w:r>
+      <w:r>
+        <w:rPr>
+          <w:rFonts w:asciiTheme="minorHAnsi" w:hAnsiTheme="minorHAnsi"/>
+        </w:rPr>
+        <w:t>VMware</w:t>
+      </w:r>
+    </w:p>
+    <w:p>
+      <w:pPr>
+        <w:pStyle w:val="ListParagraph"/>
+        <w:jc w:val="left"/>
+        <w:rPr>
+          <w:rFonts w:asciiTheme="minorHAnsi" w:hAnsiTheme="minorHAnsi"/>
+          <w:lang w:bidi="fa-IR"/>
+        </w:rPr>
+      </w:pPr>
+    </w:p>
+    <w:p>
+      <w:pPr>
+        <w:pStyle w:val="Heading2"/>
+        <w:rPr>
+          <w:rtl/>
+          <w:lang w:bidi="fa-IR"/>
+        </w:rPr>
+      </w:pPr>
+      <w:bookmarkStart w:id="8" w:name="_Toc212025652"/>
+      <w:r>
+        <w:rPr>
+          <w:rFonts w:hint="cs"/>
+          <w:rtl/>
+          <w:lang w:bidi="fa-IR"/>
+        </w:rPr>
+        <w:t>بخش سوم ـ معرفی چند سیستم عامل</w:t>
+      </w:r>
+      <w:bookmarkEnd w:id="8"/>
+    </w:p>
+    <w:p>
+      <w:pPr>
+        <w:pStyle w:val="ListParagraph"/>
+        <w:ind w:left="0"/>
+        <w:jc w:val="left"/>
+        <w:rPr>
+          <w:rFonts w:asciiTheme="minorHAnsi" w:hAnsiTheme="minorHAnsi"/>
+          <w:rtl/>
+          <w:lang w:bidi="fa-IR"/>
+        </w:rPr>
+      </w:pPr>
+      <w:r>
+        <w:rPr>
+          <w:rFonts w:asciiTheme="minorHAnsi" w:hAnsiTheme="minorHAnsi"/>
+          <w:rtl/>
+        </w:rPr>
+        <w:t>در این بخش، با چند نمونه از پرکاربردترین و مهم‌ترین سیستم‌عامل‌های حال حاضر آشنا می‌شویم و ساختار، نوع عملکرد و حوزه استفاده هرکدام را بررسی می‌کنیم</w:t>
+      </w:r>
+      <w:r>
+        <w:rPr>
+          <w:rFonts w:asciiTheme="minorHAnsi" w:hAnsiTheme="minorHAnsi" w:hint="cs"/>
+          <w:rtl/>
+          <w:lang w:bidi="fa-IR"/>
+        </w:rPr>
+        <w:t>:</w:t>
+      </w:r>
+    </w:p>
+    <w:p>
+      <w:pPr>
+        <w:pStyle w:val="ListParagraph"/>
+        <w:numPr>
+          <w:ilvl w:val="0"/>
+          <w:numId w:val="18"/>
+        </w:numPr>
+        <w:jc w:val="left"/>
+        <w:rPr>
+          <w:rFonts w:asciiTheme="minorHAnsi" w:hAnsiTheme="minorHAnsi"/>
+          <w:rtl/>
+          <w:lang w:bidi="fa-IR"/>
+        </w:rPr>
+      </w:pPr>
+      <w:r>
+        <w:rPr>
+          <w:rFonts w:asciiTheme="minorHAnsi" w:hAnsiTheme="minorHAnsi" w:hint="cs"/>
+          <w:rtl/>
+          <w:lang w:bidi="fa-IR"/>
+        </w:rPr>
+        <w:t>ویدنوز (</w:t>
+      </w:r>
+      <w:r>
+        <w:rPr>
+          <w:rFonts w:asciiTheme="minorHAnsi" w:hAnsiTheme="minorHAnsi"/>
+          <w:lang w:bidi="fa-IR"/>
+        </w:rPr>
+        <w:t>windows</w:t>
+      </w:r>
+      <w:r>
+        <w:rPr>
+          <w:rFonts w:asciiTheme="minorHAnsi" w:hAnsiTheme="minorHAnsi" w:hint="cs"/>
+          <w:rtl/>
+          <w:lang w:bidi="fa-IR"/>
+        </w:rPr>
+        <w:t>): ساختار سیستم عامل ویندوز به صورت هیبریدی است یعنی از دو ساختار میکروکرنل و کرنل یکپارچه استفاده میکند. یعنی اجزای اصلی مثل زمانبندی، مدیریت حافظه و امنیت در کرنل قرار دارن، اما بعضی از سرویس ها مثل گرافیک و درایور ها در فضای کاربر اجرا میشوند.</w:t>
+      </w:r>
+      <w:r>
+        <w:rPr>
+          <w:rFonts w:asciiTheme="minorHAnsi" w:hAnsiTheme="minorHAnsi"/>
+          <w:rtl/>
+          <w:lang w:bidi="fa-IR"/>
+        </w:rPr>
+        <w:br/>
+      </w:r>
+      <w:r>
+        <w:rPr>
+          <w:rFonts w:asciiTheme="minorHAnsi" w:hAnsiTheme="minorHAnsi" w:hint="cs"/>
+          <w:rtl/>
+          <w:lang w:bidi="fa-IR"/>
+        </w:rPr>
+        <w:t>اجزای اصلی ساختار ویندوز:</w:t>
+      </w:r>
+      <w:r>
+        <w:rPr>
+          <w:rFonts w:asciiTheme="minorHAnsi" w:hAnsiTheme="minorHAnsi"/>
+          <w:rtl/>
+          <w:lang w:bidi="fa-IR"/>
+        </w:rPr>
+        <w:br/>
+      </w:r>
+      <w:r>
+        <w:rPr>
+          <w:rFonts w:asciiTheme="minorHAnsi" w:hAnsiTheme="minorHAnsi" w:hint="cs"/>
+          <w:rtl/>
+          <w:lang w:bidi="fa-IR"/>
+        </w:rPr>
+        <w:t xml:space="preserve">۱- </w:t>
+      </w:r>
+      <w:r>
+        <w:rPr>
+          <w:rFonts w:asciiTheme="minorHAnsi" w:hAnsiTheme="minorHAnsi"/>
+          <w:lang w:bidi="fa-IR"/>
+        </w:rPr>
+        <w:t>Kernel</w:t>
+      </w:r>
+      <w:r>
+        <w:rPr>
+          <w:rFonts w:asciiTheme="minorHAnsi" w:hAnsiTheme="minorHAnsi" w:hint="cs"/>
+          <w:rtl/>
+          <w:lang w:bidi="fa-IR"/>
+        </w:rPr>
+        <w:t>: کنترل سخت افزار و زمانبندی</w:t>
+      </w:r>
+      <w:r>
+        <w:rPr>
+          <w:rFonts w:asciiTheme="minorHAnsi" w:hAnsiTheme="minorHAnsi"/>
+          <w:rtl/>
+          <w:lang w:bidi="fa-IR"/>
+        </w:rPr>
+        <w:br/>
+      </w:r>
+      <w:r>
+        <w:rPr>
+          <w:rFonts w:asciiTheme="minorHAnsi" w:hAnsiTheme="minorHAnsi" w:hint="cs"/>
+          <w:rtl/>
+          <w:lang w:bidi="fa-IR"/>
+        </w:rPr>
+        <w:t xml:space="preserve">۲- </w:t>
+      </w:r>
+      <w:r>
+        <w:rPr>
+          <w:rFonts w:asciiTheme="minorHAnsi" w:hAnsiTheme="minorHAnsi"/>
+          <w:lang w:bidi="fa-IR"/>
+        </w:rPr>
+        <w:t>Executive Services</w:t>
+      </w:r>
+      <w:r>
+        <w:rPr>
+          <w:rFonts w:asciiTheme="minorHAnsi" w:hAnsiTheme="minorHAnsi" w:hint="cs"/>
+          <w:rtl/>
+          <w:lang w:bidi="fa-IR"/>
+        </w:rPr>
+        <w:t>: مدیریت حافظه، فرآیند ها و فایل های سیستم</w:t>
+      </w:r>
+      <w:r>
+        <w:rPr>
+          <w:rFonts w:asciiTheme="minorHAnsi" w:hAnsiTheme="minorHAnsi"/>
+          <w:rtl/>
+          <w:lang w:bidi="fa-IR"/>
+        </w:rPr>
+        <w:br/>
+      </w:r>
+      <w:r>
+        <w:rPr>
+          <w:rFonts w:asciiTheme="minorHAnsi" w:hAnsiTheme="minorHAnsi" w:hint="cs"/>
+          <w:rtl/>
+          <w:lang w:bidi="fa-IR"/>
+        </w:rPr>
+        <w:t xml:space="preserve">۳- </w:t>
+      </w:r>
+      <w:r>
+        <w:rPr>
+          <w:rFonts w:asciiTheme="minorHAnsi" w:hAnsiTheme="minorHAnsi"/>
+          <w:lang w:bidi="fa-IR"/>
+        </w:rPr>
+        <w:t>Hardware Abstraction Layer</w:t>
+      </w:r>
+      <w:r>
+        <w:rPr>
+          <w:rFonts w:asciiTheme="minorHAnsi" w:hAnsiTheme="minorHAnsi" w:hint="cs"/>
+          <w:rtl/>
+          <w:lang w:bidi="fa-IR"/>
+        </w:rPr>
+        <w:t>: لایه ای برای جدا کردن بخش سخت افزاری با نرم افزاری</w:t>
+      </w:r>
+      <w:r>
+        <w:rPr>
+          <w:rFonts w:asciiTheme="minorHAnsi" w:hAnsiTheme="minorHAnsi"/>
+          <w:rtl/>
+          <w:lang w:bidi="fa-IR"/>
+        </w:rPr>
+        <w:br/>
+      </w:r>
+      <w:r>
+        <w:rPr>
+          <w:rFonts w:asciiTheme="minorHAnsi" w:hAnsiTheme="minorHAnsi" w:hint="cs"/>
+          <w:rtl/>
+          <w:lang w:bidi="fa-IR"/>
+        </w:rPr>
+        <w:t xml:space="preserve">۴- </w:t>
+      </w:r>
+      <w:r>
+        <w:rPr>
+          <w:rFonts w:asciiTheme="minorHAnsi" w:hAnsiTheme="minorHAnsi"/>
+          <w:lang w:bidi="fa-IR"/>
+        </w:rPr>
+        <w:t>Device Drivers</w:t>
+      </w:r>
+      <w:r>
+        <w:rPr>
+          <w:rFonts w:asciiTheme="minorHAnsi" w:hAnsiTheme="minorHAnsi" w:hint="cs"/>
+          <w:rtl/>
+          <w:lang w:bidi="fa-IR"/>
+        </w:rPr>
+        <w:t>: درایور های سخت افزاری که بین کرنل و سخت افزار ارتباط برقرار میکند.</w:t>
+      </w:r>
+      <w:r>
+        <w:rPr>
+          <w:rFonts w:asciiTheme="minorHAnsi" w:hAnsiTheme="minorHAnsi"/>
+          <w:rtl/>
+          <w:lang w:bidi="fa-IR"/>
+        </w:rPr>
+        <w:br/>
+      </w:r>
+      <w:r>
+        <w:rPr>
+          <w:rFonts w:asciiTheme="minorHAnsi" w:hAnsiTheme="minorHAnsi" w:hint="cs"/>
+          <w:rtl/>
+          <w:lang w:bidi="fa-IR"/>
+        </w:rPr>
+        <w:t xml:space="preserve">۵- </w:t>
+      </w:r>
+      <w:r>
+        <w:rPr>
+          <w:rFonts w:asciiTheme="minorHAnsi" w:hAnsiTheme="minorHAnsi"/>
+          <w:lang w:bidi="fa-IR"/>
+        </w:rPr>
+        <w:t>User Mode</w:t>
+      </w:r>
+      <w:r>
+        <w:rPr>
+          <w:rFonts w:asciiTheme="minorHAnsi" w:hAnsiTheme="minorHAnsi" w:hint="cs"/>
+          <w:rtl/>
+          <w:lang w:bidi="fa-IR"/>
+        </w:rPr>
+        <w:t>: شامل رابط کاربری، سرویس ها و اپلیکیشن ها میشود.</w:t>
+      </w:r>
+      <w:r>
+        <w:rPr>
+          <w:rFonts w:asciiTheme="minorHAnsi" w:hAnsiTheme="minorHAnsi"/>
+          <w:rtl/>
+          <w:lang w:bidi="fa-IR"/>
+        </w:rPr>
+        <w:br/>
+      </w:r>
+      <w:r>
+        <w:rPr>
+          <w:rFonts w:asciiTheme="minorHAnsi" w:hAnsiTheme="minorHAnsi" w:hint="cs"/>
+          <w:rtl/>
+          <w:lang w:bidi="fa-IR"/>
+        </w:rPr>
+        <w:t>سیستم عامل ویندوز رو میتوان در سیستم عامل های چند وظیفه ای، چند کاربره، اشتراک زمانی قرار داد.</w:t>
+      </w:r>
+    </w:p>
+    <w:p>
+      <w:pPr>
+        <w:pStyle w:val="ListParagraph"/>
+        <w:numPr>
+          <w:ilvl w:val="0"/>
+          <w:numId w:val="18"/>
+        </w:numPr>
+        <w:jc w:val="left"/>
+        <w:rPr>
+          <w:rFonts w:asciiTheme="minorHAnsi" w:hAnsiTheme="minorHAnsi"/>
+          <w:lang w:bidi="fa-IR"/>
+        </w:rPr>
+      </w:pPr>
+      <w:r>
+        <w:rPr>
+          <w:rFonts w:asciiTheme="minorHAnsi" w:hAnsiTheme="minorHAnsi" w:hint="cs"/>
+          <w:rtl/>
+          <w:lang w:bidi="fa-IR"/>
+        </w:rPr>
+        <w:lastRenderedPageBreak/>
+        <w:t xml:space="preserve">سیستم عامل </w:t>
+      </w:r>
+      <w:r>
+        <w:rPr>
+          <w:rFonts w:asciiTheme="minorHAnsi" w:hAnsiTheme="minorHAnsi"/>
+          <w:lang w:bidi="fa-IR"/>
+        </w:rPr>
+        <w:t xml:space="preserve">Mac </w:t>
+      </w:r>
+      <w:proofErr w:type="spellStart"/>
+      <w:r>
+        <w:rPr>
+          <w:rFonts w:asciiTheme="minorHAnsi" w:hAnsiTheme="minorHAnsi"/>
+          <w:lang w:bidi="fa-IR"/>
+        </w:rPr>
+        <w:t>os</w:t>
+      </w:r>
+      <w:proofErr w:type="spellEnd"/>
+      <w:r>
+        <w:rPr>
+          <w:rFonts w:asciiTheme="minorHAnsi" w:hAnsiTheme="minorHAnsi" w:hint="cs"/>
+          <w:rtl/>
+          <w:lang w:bidi="fa-IR"/>
+        </w:rPr>
+        <w:t xml:space="preserve">: از کرنل ترکیبی استفاده میکند از دو بخش اصلی </w:t>
+      </w:r>
+      <w:r>
+        <w:rPr>
+          <w:rFonts w:asciiTheme="minorHAnsi" w:hAnsiTheme="minorHAnsi"/>
+          <w:lang w:bidi="fa-IR"/>
+        </w:rPr>
+        <w:t>Mach, BSD</w:t>
+      </w:r>
+      <w:r>
+        <w:rPr>
+          <w:rFonts w:asciiTheme="minorHAnsi" w:hAnsiTheme="minorHAnsi" w:hint="cs"/>
+          <w:rtl/>
+          <w:lang w:bidi="fa-IR"/>
+        </w:rPr>
+        <w:t xml:space="preserve"> استفاده میکند.</w:t>
+      </w:r>
+      <w:r>
+        <w:rPr>
+          <w:rFonts w:asciiTheme="minorHAnsi" w:hAnsiTheme="minorHAnsi"/>
+          <w:rtl/>
+          <w:lang w:bidi="fa-IR"/>
+        </w:rPr>
+        <w:br/>
+      </w:r>
+      <w:r>
+        <w:rPr>
+          <w:rFonts w:asciiTheme="minorHAnsi" w:hAnsiTheme="minorHAnsi"/>
+          <w:lang w:bidi="fa-IR"/>
+        </w:rPr>
+        <w:t>Mach</w:t>
+      </w:r>
+      <w:r>
+        <w:rPr>
+          <w:rFonts w:asciiTheme="minorHAnsi" w:hAnsiTheme="minorHAnsi" w:hint="cs"/>
+          <w:rtl/>
+          <w:lang w:bidi="fa-IR"/>
+        </w:rPr>
+        <w:t>: میکروکرنل برای مدیریت حافظه و زمانبندی و پیام رسانی بین فرآیند هاست.</w:t>
+      </w:r>
+      <w:r>
+        <w:rPr>
+          <w:rFonts w:asciiTheme="minorHAnsi" w:hAnsiTheme="minorHAnsi"/>
+          <w:rtl/>
+          <w:lang w:bidi="fa-IR"/>
+        </w:rPr>
+        <w:br/>
+      </w:r>
+      <w:r>
+        <w:rPr>
+          <w:rFonts w:asciiTheme="minorHAnsi" w:hAnsiTheme="minorHAnsi"/>
+          <w:lang w:bidi="fa-IR"/>
+        </w:rPr>
+        <w:t>BSD</w:t>
+      </w:r>
+      <w:r>
+        <w:rPr>
+          <w:rFonts w:asciiTheme="minorHAnsi" w:hAnsiTheme="minorHAnsi" w:hint="cs"/>
+          <w:rtl/>
+          <w:lang w:bidi="fa-IR"/>
+        </w:rPr>
+        <w:t>: کرنل یکپارچه که برای سرویس های سطح بالا مثل فایل سیستم، شبکه و امنیت استفاد میشود.</w:t>
+      </w:r>
+      <w:r>
+        <w:rPr>
+          <w:rFonts w:asciiTheme="minorHAnsi" w:hAnsiTheme="minorHAnsi"/>
+          <w:rtl/>
+          <w:lang w:bidi="fa-IR"/>
+        </w:rPr>
+        <w:br/>
+      </w:r>
+      <w:r>
+        <w:rPr>
+          <w:rFonts w:asciiTheme="minorHAnsi" w:hAnsiTheme="minorHAnsi" w:hint="cs"/>
+          <w:rtl/>
+          <w:lang w:bidi="fa-IR"/>
+        </w:rPr>
+        <w:t xml:space="preserve">این ترکیب باعث میشود که سیستم عامل </w:t>
+      </w:r>
+      <w:r>
+        <w:rPr>
+          <w:rFonts w:asciiTheme="minorHAnsi" w:hAnsiTheme="minorHAnsi"/>
+          <w:lang w:bidi="fa-IR"/>
+        </w:rPr>
+        <w:t xml:space="preserve">Mac </w:t>
+      </w:r>
+      <w:proofErr w:type="spellStart"/>
+      <w:r>
+        <w:rPr>
+          <w:rFonts w:asciiTheme="minorHAnsi" w:hAnsiTheme="minorHAnsi"/>
+          <w:lang w:bidi="fa-IR"/>
+        </w:rPr>
+        <w:t>os</w:t>
+      </w:r>
+      <w:proofErr w:type="spellEnd"/>
+      <w:r>
+        <w:rPr>
+          <w:rFonts w:asciiTheme="minorHAnsi" w:hAnsiTheme="minorHAnsi" w:hint="cs"/>
+          <w:rtl/>
+          <w:lang w:bidi="fa-IR"/>
+        </w:rPr>
+        <w:t xml:space="preserve"> هم عملکرد بالا داشته باشد و هم ساختار ماژولار و قابل توسعه. </w:t>
+      </w:r>
+      <w:r>
+        <w:rPr>
+          <w:rFonts w:asciiTheme="minorHAnsi" w:hAnsiTheme="minorHAnsi"/>
+          <w:rtl/>
+          <w:lang w:bidi="fa-IR"/>
+        </w:rPr>
+        <w:br/>
+      </w:r>
+      <w:r>
+        <w:rPr>
+          <w:rFonts w:asciiTheme="minorHAnsi" w:hAnsiTheme="minorHAnsi" w:hint="cs"/>
+          <w:rtl/>
+          <w:lang w:bidi="fa-IR"/>
+        </w:rPr>
+        <w:t xml:space="preserve">اجزای اصلی سیستم عامل </w:t>
+      </w:r>
+      <w:r>
+        <w:rPr>
+          <w:rFonts w:asciiTheme="minorHAnsi" w:hAnsiTheme="minorHAnsi"/>
+          <w:lang w:bidi="fa-IR"/>
+        </w:rPr>
+        <w:t xml:space="preserve">Mac </w:t>
+      </w:r>
+      <w:proofErr w:type="spellStart"/>
+      <w:r>
+        <w:rPr>
+          <w:rFonts w:asciiTheme="minorHAnsi" w:hAnsiTheme="minorHAnsi"/>
+          <w:lang w:bidi="fa-IR"/>
+        </w:rPr>
+        <w:t>os</w:t>
+      </w:r>
+      <w:proofErr w:type="spellEnd"/>
+      <w:r>
+        <w:rPr>
+          <w:rFonts w:asciiTheme="minorHAnsi" w:hAnsiTheme="minorHAnsi" w:hint="cs"/>
+          <w:rtl/>
+          <w:lang w:bidi="fa-IR"/>
+        </w:rPr>
+        <w:t xml:space="preserve"> عبارت است از: </w:t>
+      </w:r>
+      <w:r>
+        <w:rPr>
+          <w:rFonts w:asciiTheme="minorHAnsi" w:hAnsiTheme="minorHAnsi"/>
+          <w:rtl/>
+          <w:lang w:bidi="fa-IR"/>
+        </w:rPr>
+        <w:br/>
+      </w:r>
+      <w:r>
+        <w:rPr>
+          <w:rFonts w:asciiTheme="minorHAnsi" w:hAnsiTheme="minorHAnsi" w:hint="cs"/>
+          <w:rtl/>
+          <w:lang w:bidi="fa-IR"/>
+        </w:rPr>
+        <w:t xml:space="preserve">۱- </w:t>
+      </w:r>
+      <w:r>
+        <w:rPr>
+          <w:rFonts w:asciiTheme="minorHAnsi" w:hAnsiTheme="minorHAnsi"/>
+          <w:lang w:bidi="fa-IR"/>
+        </w:rPr>
+        <w:t>Mach Kernel</w:t>
+      </w:r>
+      <w:r>
+        <w:rPr>
+          <w:rFonts w:asciiTheme="minorHAnsi" w:hAnsiTheme="minorHAnsi" w:hint="cs"/>
+          <w:rtl/>
+          <w:lang w:bidi="fa-IR"/>
+        </w:rPr>
+        <w:t>: مدیریت منابع پایه مثل زمانبندی و حافظه</w:t>
+      </w:r>
+      <w:r>
+        <w:rPr>
+          <w:rFonts w:asciiTheme="minorHAnsi" w:hAnsiTheme="minorHAnsi"/>
+          <w:rtl/>
+          <w:lang w:bidi="fa-IR"/>
+        </w:rPr>
+        <w:br/>
+      </w:r>
+      <w:r>
+        <w:rPr>
+          <w:rFonts w:asciiTheme="minorHAnsi" w:hAnsiTheme="minorHAnsi" w:hint="cs"/>
+          <w:rtl/>
+          <w:lang w:bidi="fa-IR"/>
+        </w:rPr>
+        <w:t xml:space="preserve">۲- </w:t>
+      </w:r>
+      <w:r>
+        <w:rPr>
+          <w:rFonts w:asciiTheme="minorHAnsi" w:hAnsiTheme="minorHAnsi"/>
+          <w:lang w:bidi="fa-IR"/>
+        </w:rPr>
+        <w:t>BSD Layer</w:t>
+      </w:r>
+      <w:r>
+        <w:rPr>
+          <w:rFonts w:asciiTheme="minorHAnsi" w:hAnsiTheme="minorHAnsi" w:hint="cs"/>
+          <w:rtl/>
+          <w:lang w:bidi="fa-IR"/>
+        </w:rPr>
+        <w:t xml:space="preserve">: </w:t>
+      </w:r>
+      <w:r>
+        <w:rPr>
+          <w:rFonts w:asciiTheme="minorHAnsi" w:hAnsiTheme="minorHAnsi" w:hint="cs"/>
+          <w:rtl/>
+          <w:lang w:bidi="fa-IR"/>
+        </w:rPr>
+        <w:t>سرویس هایی مثل فایل سیستم، شبکه و امنیت</w:t>
+      </w:r>
+      <w:r>
+        <w:rPr>
+          <w:rFonts w:asciiTheme="minorHAnsi" w:hAnsiTheme="minorHAnsi"/>
+          <w:rtl/>
+          <w:lang w:bidi="fa-IR"/>
+        </w:rPr>
+        <w:br/>
+      </w:r>
+      <w:r>
+        <w:rPr>
+          <w:rFonts w:asciiTheme="minorHAnsi" w:hAnsiTheme="minorHAnsi" w:hint="cs"/>
+          <w:rtl/>
+          <w:lang w:bidi="fa-IR"/>
+        </w:rPr>
+        <w:t xml:space="preserve">۳- </w:t>
+      </w:r>
+      <w:proofErr w:type="spellStart"/>
+      <w:r>
+        <w:rPr>
+          <w:rFonts w:asciiTheme="minorHAnsi" w:hAnsiTheme="minorHAnsi"/>
+          <w:lang w:bidi="fa-IR"/>
+        </w:rPr>
+        <w:t>IOKit</w:t>
+      </w:r>
+      <w:proofErr w:type="spellEnd"/>
+      <w:r>
+        <w:rPr>
+          <w:rFonts w:asciiTheme="minorHAnsi" w:hAnsiTheme="minorHAnsi" w:hint="cs"/>
+          <w:rtl/>
+          <w:lang w:bidi="fa-IR"/>
+        </w:rPr>
+        <w:t xml:space="preserve">: چهارچوب درایور های سخت افزاری با زبان </w:t>
+      </w:r>
+      <w:proofErr w:type="spellStart"/>
+      <w:r>
+        <w:rPr>
+          <w:rFonts w:asciiTheme="minorHAnsi" w:hAnsiTheme="minorHAnsi"/>
+          <w:lang w:bidi="fa-IR"/>
+        </w:rPr>
+        <w:t>cpp</w:t>
+      </w:r>
+      <w:proofErr w:type="spellEnd"/>
+      <w:r>
+        <w:rPr>
+          <w:rFonts w:asciiTheme="minorHAnsi" w:hAnsiTheme="minorHAnsi"/>
+          <w:rtl/>
+          <w:lang w:bidi="fa-IR"/>
+        </w:rPr>
+        <w:br/>
+      </w:r>
+      <w:r>
+        <w:rPr>
+          <w:rFonts w:asciiTheme="minorHAnsi" w:hAnsiTheme="minorHAnsi" w:hint="cs"/>
+          <w:rtl/>
+          <w:lang w:bidi="fa-IR"/>
+        </w:rPr>
+        <w:t xml:space="preserve">۴- </w:t>
+      </w:r>
+      <w:r>
+        <w:rPr>
+          <w:rFonts w:asciiTheme="minorHAnsi" w:hAnsiTheme="minorHAnsi"/>
+          <w:lang w:bidi="fa-IR"/>
+        </w:rPr>
+        <w:t>User Space</w:t>
+      </w:r>
+      <w:r>
+        <w:rPr>
+          <w:rFonts w:asciiTheme="minorHAnsi" w:hAnsiTheme="minorHAnsi" w:hint="cs"/>
+          <w:rtl/>
+          <w:lang w:bidi="fa-IR"/>
+        </w:rPr>
+        <w:t>: رابط گرافیکی و سرویس های سطح کاربر و همچنین اپلیکیشن ها</w:t>
+      </w:r>
+      <w:r>
+        <w:rPr>
+          <w:rFonts w:asciiTheme="minorHAnsi" w:hAnsiTheme="minorHAnsi"/>
+          <w:rtl/>
+          <w:lang w:bidi="fa-IR"/>
+        </w:rPr>
+        <w:br/>
+      </w:r>
+      <w:r>
+        <w:rPr>
+          <w:rFonts w:asciiTheme="minorHAnsi" w:hAnsiTheme="minorHAnsi" w:hint="cs"/>
+          <w:rtl/>
+          <w:lang w:bidi="fa-IR"/>
+        </w:rPr>
+        <w:t xml:space="preserve">از این رو سیستم عامل </w:t>
+      </w:r>
+      <w:r>
+        <w:rPr>
+          <w:rFonts w:asciiTheme="minorHAnsi" w:hAnsiTheme="minorHAnsi"/>
+          <w:lang w:bidi="fa-IR"/>
+        </w:rPr>
+        <w:t xml:space="preserve">Mac </w:t>
+      </w:r>
+      <w:proofErr w:type="spellStart"/>
+      <w:r>
+        <w:rPr>
+          <w:rFonts w:asciiTheme="minorHAnsi" w:hAnsiTheme="minorHAnsi"/>
+          <w:lang w:bidi="fa-IR"/>
+        </w:rPr>
+        <w:t>os</w:t>
+      </w:r>
+      <w:proofErr w:type="spellEnd"/>
+      <w:r>
+        <w:rPr>
+          <w:rFonts w:asciiTheme="minorHAnsi" w:hAnsiTheme="minorHAnsi" w:hint="cs"/>
+          <w:rtl/>
+          <w:lang w:bidi="fa-IR"/>
+        </w:rPr>
+        <w:t xml:space="preserve"> یک سیستم عامل چند وظیفه ای چند کاربره و اشتراک زمانی به حساب می</w:t>
+      </w:r>
+      <w:r>
+        <w:rPr>
+          <w:rFonts w:asciiTheme="minorHAnsi" w:hAnsiTheme="minorHAnsi"/>
+          <w:rtl/>
+          <w:lang w:bidi="fa-IR"/>
+        </w:rPr>
+        <w:softHyphen/>
+      </w:r>
+      <w:r>
+        <w:rPr>
+          <w:rFonts w:asciiTheme="minorHAnsi" w:hAnsiTheme="minorHAnsi" w:hint="cs"/>
+          <w:rtl/>
+          <w:lang w:bidi="fa-IR"/>
+        </w:rPr>
+        <w:t>آید.</w:t>
+      </w:r>
+    </w:p>
+    <w:p>
+      <w:pPr>
+        <w:pStyle w:val="ListParagraph"/>
+        <w:numPr>
+          <w:ilvl w:val="0"/>
+          <w:numId w:val="18"/>
+        </w:numPr>
+        <w:jc w:val="left"/>
+        <w:rPr>
+          <w:rFonts w:asciiTheme="minorHAnsi" w:hAnsiTheme="minorHAnsi"/>
+          <w:lang w:bidi="fa-IR"/>
+        </w:rPr>
+      </w:pPr>
+      <w:r>
+        <w:rPr>
+          <w:rFonts w:asciiTheme="minorHAnsi" w:hAnsiTheme="minorHAnsi" w:hint="cs"/>
+          <w:rtl/>
+          <w:lang w:bidi="fa-IR"/>
+        </w:rPr>
+        <w:t xml:space="preserve">سیستم عامل </w:t>
+      </w:r>
+      <w:proofErr w:type="spellStart"/>
+      <w:r>
+        <w:rPr>
+          <w:rFonts w:asciiTheme="minorHAnsi" w:hAnsiTheme="minorHAnsi"/>
+          <w:lang w:bidi="fa-IR"/>
+        </w:rPr>
+        <w:t>linux</w:t>
+      </w:r>
+      <w:proofErr w:type="spellEnd"/>
+      <w:r>
+        <w:rPr>
+          <w:rFonts w:asciiTheme="minorHAnsi" w:hAnsiTheme="minorHAnsi" w:hint="cs"/>
+          <w:rtl/>
+          <w:lang w:bidi="fa-IR"/>
+        </w:rPr>
+        <w:t xml:space="preserve">: لینوکس از کرنل یکپارچه استفاده میکند یعنی همه اجزای اصلی مثل مدیریت حافظه، زمانبدی و فایل سیستم و درایور ها در یک فضای کرنل اجرا میشود. </w:t>
+      </w:r>
+      <w:r>
+        <w:rPr>
+          <w:rFonts w:asciiTheme="minorHAnsi" w:hAnsiTheme="minorHAnsi"/>
+          <w:rtl/>
+        </w:rPr>
+        <w:t>با این حال، لینوکس از ماژول‌های قابل بارگذاری پشتیبانی می‌کنه که باعث انعطاف‌پذیری بالا در اضافه یا حذف اجزا می‌شه</w:t>
+      </w:r>
+      <w:r>
+        <w:rPr>
+          <w:rFonts w:asciiTheme="minorHAnsi" w:hAnsiTheme="minorHAnsi"/>
+          <w:lang w:bidi="fa-IR"/>
+        </w:rPr>
+        <w:t>.</w:t>
+      </w:r>
+      <w:r>
+        <w:rPr>
+          <w:rFonts w:asciiTheme="minorHAnsi" w:hAnsiTheme="minorHAnsi"/>
+          <w:rtl/>
+          <w:lang w:bidi="fa-IR"/>
+        </w:rPr>
+        <w:br/>
+      </w:r>
+      <w:r>
+        <w:rPr>
+          <w:rFonts w:asciiTheme="minorHAnsi" w:hAnsiTheme="minorHAnsi" w:hint="cs"/>
+          <w:rtl/>
+          <w:lang w:bidi="fa-IR"/>
+        </w:rPr>
+        <w:t xml:space="preserve">اجزای اصلی ساختار لینوکس عبارت است از: </w:t>
+      </w:r>
+      <w:r>
+        <w:rPr>
+          <w:rFonts w:asciiTheme="minorHAnsi" w:hAnsiTheme="minorHAnsi"/>
+          <w:rtl/>
+          <w:lang w:bidi="fa-IR"/>
+        </w:rPr>
+        <w:br/>
+      </w:r>
+      <w:r>
+        <w:rPr>
+          <w:rFonts w:asciiTheme="minorHAnsi" w:hAnsiTheme="minorHAnsi" w:hint="cs"/>
+          <w:rtl/>
+          <w:lang w:bidi="fa-IR"/>
+        </w:rPr>
+        <w:t xml:space="preserve">۱- </w:t>
+      </w:r>
+      <w:r>
+        <w:rPr>
+          <w:rFonts w:asciiTheme="minorHAnsi" w:hAnsiTheme="minorHAnsi"/>
+          <w:lang w:bidi="fa-IR"/>
+        </w:rPr>
+        <w:t>Kernel Space</w:t>
+      </w:r>
+      <w:r>
+        <w:rPr>
+          <w:rFonts w:asciiTheme="minorHAnsi" w:hAnsiTheme="minorHAnsi" w:hint="cs"/>
+          <w:rtl/>
+          <w:lang w:bidi="fa-IR"/>
+        </w:rPr>
+        <w:t xml:space="preserve">: </w:t>
+      </w:r>
+      <w:r>
+        <w:rPr>
+          <w:rFonts w:asciiTheme="minorHAnsi" w:hAnsiTheme="minorHAnsi"/>
+          <w:rtl/>
+        </w:rPr>
+        <w:t>شامل مدیریت حافظه، فرآیندها، درایورها، و سیستم‌فایل</w:t>
+      </w:r>
+      <w:r>
+        <w:rPr>
+          <w:rFonts w:asciiTheme="minorHAnsi" w:hAnsiTheme="minorHAnsi"/>
+          <w:rtl/>
+        </w:rPr>
+        <w:br/>
+      </w:r>
+      <w:r>
+        <w:rPr>
+          <w:rFonts w:asciiTheme="minorHAnsi" w:hAnsiTheme="minorHAnsi" w:hint="cs"/>
+          <w:rtl/>
+          <w:lang w:bidi="fa-IR"/>
+        </w:rPr>
+        <w:t xml:space="preserve">۲- </w:t>
+      </w:r>
+      <w:r>
+        <w:rPr>
+          <w:rFonts w:asciiTheme="minorHAnsi" w:hAnsiTheme="minorHAnsi"/>
+          <w:lang w:bidi="fa-IR"/>
+        </w:rPr>
+        <w:t>System Calls</w:t>
+      </w:r>
+      <w:r>
+        <w:rPr>
+          <w:rFonts w:asciiTheme="minorHAnsi" w:hAnsiTheme="minorHAnsi" w:hint="cs"/>
+          <w:rtl/>
+          <w:lang w:bidi="fa-IR"/>
+        </w:rPr>
+        <w:t>: رابط بین فضای کاربر و کرنل برای اجرای عملیات های سیستمی</w:t>
+      </w:r>
+      <w:r>
+        <w:rPr>
+          <w:rFonts w:asciiTheme="minorHAnsi" w:hAnsiTheme="minorHAnsi"/>
+          <w:rtl/>
+          <w:lang w:bidi="fa-IR"/>
+        </w:rPr>
+        <w:br/>
+      </w:r>
+      <w:r>
+        <w:rPr>
+          <w:rFonts w:asciiTheme="minorHAnsi" w:hAnsiTheme="minorHAnsi" w:hint="cs"/>
+          <w:rtl/>
+          <w:lang w:bidi="fa-IR"/>
+        </w:rPr>
+        <w:t xml:space="preserve">۳- </w:t>
+      </w:r>
+      <w:r>
+        <w:rPr>
+          <w:rFonts w:asciiTheme="minorHAnsi" w:hAnsiTheme="minorHAnsi"/>
+          <w:lang w:bidi="fa-IR"/>
+        </w:rPr>
+        <w:t>User Space</w:t>
+      </w:r>
+      <w:r>
+        <w:rPr>
+          <w:rFonts w:asciiTheme="minorHAnsi" w:hAnsiTheme="minorHAnsi" w:hint="cs"/>
+          <w:rtl/>
+          <w:lang w:bidi="fa-IR"/>
+        </w:rPr>
+        <w:t xml:space="preserve">: </w:t>
+      </w:r>
+      <w:r>
+        <w:rPr>
+          <w:rFonts w:asciiTheme="minorHAnsi" w:hAnsiTheme="minorHAnsi" w:hint="cs"/>
+          <w:sz w:val="24"/>
+          <w:szCs w:val="24"/>
+          <w:rtl/>
+          <w:lang w:bidi="fa-IR"/>
+        </w:rPr>
+        <w:t>شامل رابط گرافیکی کاربر، رابط خط زمانی (</w:t>
+      </w:r>
+      <w:r>
+        <w:rPr>
+          <w:rFonts w:asciiTheme="minorHAnsi" w:hAnsiTheme="minorHAnsi"/>
+          <w:sz w:val="24"/>
+          <w:szCs w:val="24"/>
+          <w:lang w:bidi="fa-IR"/>
+        </w:rPr>
+        <w:t>shell</w:t>
+      </w:r>
+      <w:r>
+        <w:rPr>
+          <w:rFonts w:asciiTheme="minorHAnsi" w:hAnsiTheme="minorHAnsi" w:hint="cs"/>
+          <w:sz w:val="24"/>
+          <w:szCs w:val="24"/>
+          <w:rtl/>
+          <w:lang w:bidi="fa-IR"/>
+        </w:rPr>
+        <w:t xml:space="preserve">) و محیط های گرافیکی مثل </w:t>
+      </w:r>
+      <w:r>
+        <w:rPr>
+          <w:rFonts w:asciiTheme="minorHAnsi" w:hAnsiTheme="minorHAnsi"/>
+          <w:sz w:val="24"/>
+          <w:szCs w:val="24"/>
+          <w:lang w:bidi="fa-IR"/>
+        </w:rPr>
+        <w:t>KDE</w:t>
+      </w:r>
+      <w:r>
+        <w:rPr>
+          <w:rFonts w:asciiTheme="minorHAnsi" w:hAnsiTheme="minorHAnsi"/>
+          <w:rtl/>
+          <w:lang w:bidi="fa-IR"/>
+        </w:rPr>
+        <w:br/>
+      </w:r>
+      <w:r>
+        <w:rPr>
+          <w:rFonts w:asciiTheme="minorHAnsi" w:hAnsiTheme="minorHAnsi" w:hint="cs"/>
+          <w:rtl/>
+          <w:lang w:bidi="fa-IR"/>
+        </w:rPr>
+        <w:t xml:space="preserve">سیستم عامل لینوکس یک سیستم عامل </w:t>
+      </w:r>
+      <w:r>
+        <w:rPr>
+          <w:rFonts w:asciiTheme="minorHAnsi" w:hAnsiTheme="minorHAnsi"/>
+          <w:rtl/>
+        </w:rPr>
+        <w:t>چندوظیفه‌ای، چندکاربره، اشتراک زمانی، قابل استفاده در دسکتاپ، سرور، موبایل و سیستم‌های تعبیه‌شده</w:t>
+      </w:r>
+      <w:r>
+        <w:rPr>
+          <w:rFonts w:asciiTheme="minorHAnsi" w:hAnsiTheme="minorHAnsi" w:hint="cs"/>
+          <w:rtl/>
+        </w:rPr>
+        <w:t xml:space="preserve"> است.</w:t>
+      </w:r>
+      <w:r>
+        <w:rPr>
+          <w:rFonts w:asciiTheme="minorHAnsi" w:hAnsiTheme="minorHAnsi"/>
+          <w:rtl/>
+          <w:lang w:bidi="fa-IR"/>
+        </w:rPr>
+        <w:br/>
+      </w:r>
+    </w:p>
+    <w:p>
+      <w:pPr>
+        <w:jc w:val="left"/>
+        <w:rPr>
+          <w:rFonts w:asciiTheme="minorHAnsi" w:hAnsiTheme="minorHAnsi"/>
+          <w:lang w:bidi="fa-IR"/>
+        </w:rPr>
+      </w:pPr>
+    </w:p>
+    <w:p>
+      <w:pPr>
+        <w:jc w:val="left"/>
+        <w:rPr>
+          <w:rFonts w:asciiTheme="minorHAnsi" w:hAnsiTheme="minorHAnsi"/>
+          <w:lang w:bidi="fa-IR"/>
+        </w:rPr>
+      </w:pPr>
+    </w:p>
+    <w:p>
+      <w:pPr>
+        <w:ind w:left="360"/>
+        <w:jc w:val="left"/>
+        <w:rPr>
+          <w:rFonts w:asciiTheme="minorHAnsi" w:hAnsiTheme="minorHAnsi"/>
+          <w:lang w:bidi="fa-IR"/>
+        </w:rPr>
+      </w:pPr>
+    </w:p>
+    <w:p>
+      <w:pPr>
+        <w:ind w:left="360"/>
+        <w:jc w:val="left"/>
+        <w:rPr>
+          <w:rFonts w:asciiTheme="minorHAnsi" w:hAnsiTheme="minorHAnsi"/>
+          <w:lang w:bidi="fa-IR"/>
+        </w:rPr>
+      </w:pPr>
+    </w:p>
+    <w:p>
+      <w:pPr>
+        <w:jc w:val="left"/>
+        <w:rPr>
+          <w:rFonts w:asciiTheme="minorHAnsi" w:hAnsiTheme="minorHAnsi"/>
+          <w:lang w:bidi="fa-IR"/>
+        </w:rPr>
+      </w:pPr>
+    </w:p>
+    <w:p>
+      <w:pPr>
+        <w:jc w:val="left"/>
+        <w:rPr>
           <w:rFonts w:asciiTheme="minorHAnsi" w:hAnsiTheme="minorHAnsi" w:hint="cs"/>
           <w:lang w:bidi="fa-IR"/>
         </w:rPr>
       </w:pPr>
     </w:p>
     <w:sectPr>
-      <w:footerReference w:type="default" r:id="rId7"/>
+      <w:footerReference w:type="default" r:id="rId8"/>
       <w:pgSz w:w="12240" w:h="15840"/>
       <w:pgMar w:top="1440" w:right="1440" w:bottom="1440" w:left="1440" w:header="720" w:footer="720" w:gutter="0"/>
       <w:pgBorders w:offsetFrom="page">
@@ -5750,6 +8991,95 @@
     </w:lvl>
   </w:abstractNum>
   <w:abstractNum w:abstractNumId="8" w15:restartNumberingAfterBreak="0">
+    <w:nsid w:val="554753B6"/>
+    <w:multiLevelType w:val="hybridMultilevel"/>
+    <w:tmpl w:val="B37C30F4"/>
+    <w:lvl w:ilvl="0" w:tplc="244CBDFA">
+      <w:start w:val="1"/>
+      <w:numFmt w:val="decimalFullWidth"/>
+      <w:lvlText w:val="%1-"/>
+      <w:lvlJc w:val="left"/>
+      <w:pPr>
+        <w:ind w:left="720" w:hanging="360"/>
+      </w:pPr>
+      <w:rPr>
+        <w:rFonts w:hint="default"/>
+      </w:rPr>
+    </w:lvl>
+    <w:lvl w:ilvl="1" w:tplc="04090019" w:tentative="1">
+      <w:start w:val="1"/>
+      <w:numFmt w:val="lowerLetter"/>
+      <w:lvlText w:val="%2."/>
+      <w:lvlJc w:val="left"/>
+      <w:pPr>
+        <w:ind w:left="1440" w:hanging="360"/>
+      </w:pPr>
+    </w:lvl>
+    <w:lvl w:ilvl="2" w:tplc="0409001B" w:tentative="1">
+      <w:start w:val="1"/>
+      <w:numFmt w:val="lowerRoman"/>
+      <w:lvlText w:val="%3."/>
+      <w:lvlJc w:val="right"/>
+      <w:pPr>
+        <w:ind w:left="2160" w:hanging="180"/>
+      </w:pPr>
+    </w:lvl>
+    <w:lvl w:ilvl="3" w:tplc="0409000F" w:tentative="1">
+      <w:start w:val="1"/>
+      <w:numFmt w:val="decimal"/>
+      <w:lvlText w:val="%4."/>
+      <w:lvlJc w:val="left"/>
+      <w:pPr>
+        <w:ind w:left="2880" w:hanging="360"/>
+      </w:pPr>
+    </w:lvl>
+    <w:lvl w:ilvl="4" w:tplc="04090019" w:tentative="1">
+      <w:start w:val="1"/>
+      <w:numFmt w:val="lowerLetter"/>
+      <w:lvlText w:val="%5."/>
+      <w:lvlJc w:val="left"/>
+      <w:pPr>
+        <w:ind w:left="3600" w:hanging="360"/>
+      </w:pPr>
+    </w:lvl>
+    <w:lvl w:ilvl="5" w:tplc="0409001B" w:tentative="1">
+      <w:start w:val="1"/>
+      <w:numFmt w:val="lowerRoman"/>
+      <w:lvlText w:val="%6."/>
+      <w:lvlJc w:val="right"/>
+      <w:pPr>
+        <w:ind w:left="4320" w:hanging="180"/>
+      </w:pPr>
+    </w:lvl>
+    <w:lvl w:ilvl="6" w:tplc="0409000F" w:tentative="1">
+      <w:start w:val="1"/>
+      <w:numFmt w:val="decimal"/>
+      <w:lvlText w:val="%7."/>
+      <w:lvlJc w:val="left"/>
+      <w:pPr>
+        <w:ind w:left="5040" w:hanging="360"/>
+      </w:pPr>
+    </w:lvl>
+    <w:lvl w:ilvl="7" w:tplc="04090019" w:tentative="1">
+      <w:start w:val="1"/>
+      <w:numFmt w:val="lowerLetter"/>
+      <w:lvlText w:val="%8."/>
+      <w:lvlJc w:val="left"/>
+      <w:pPr>
+        <w:ind w:left="5760" w:hanging="360"/>
+      </w:pPr>
+    </w:lvl>
+    <w:lvl w:ilvl="8" w:tplc="0409001B" w:tentative="1">
+      <w:start w:val="1"/>
+      <w:numFmt w:val="lowerRoman"/>
+      <w:lvlText w:val="%9."/>
+      <w:lvlJc w:val="right"/>
+      <w:pPr>
+        <w:ind w:left="6480" w:hanging="180"/>
+      </w:pPr>
+    </w:lvl>
+  </w:abstractNum>
+  <w:abstractNum w:abstractNumId="9" w15:restartNumberingAfterBreak="0">
     <w:nsid w:val="5F8C4426"/>
     <w:multiLevelType w:val="hybridMultilevel"/>
     <w:tmpl w:val="B546AC78"/>
@@ -5838,7 +9168,7 @@
       </w:pPr>
     </w:lvl>
   </w:abstractNum>
-  <w:abstractNum w:abstractNumId="9" w15:restartNumberingAfterBreak="0">
+  <w:abstractNum w:abstractNumId="10" w15:restartNumberingAfterBreak="0">
     <w:nsid w:val="60DA51EC"/>
     <w:multiLevelType w:val="multilevel"/>
     <w:tmpl w:val="42AE82F8"/>
@@ -5987,7 +9317,96 @@
       </w:rPr>
     </w:lvl>
   </w:abstractNum>
-  <w:abstractNum w:abstractNumId="10" w15:restartNumberingAfterBreak="0">
+  <w:abstractNum w:abstractNumId="11" w15:restartNumberingAfterBreak="0">
+    <w:nsid w:val="627D2824"/>
+    <w:multiLevelType w:val="hybridMultilevel"/>
+    <w:tmpl w:val="E334EF6C"/>
+    <w:lvl w:ilvl="0" w:tplc="45A2A628">
+      <w:start w:val="1"/>
+      <w:numFmt w:val="decimalFullWidth"/>
+      <w:lvlText w:val="%1-"/>
+      <w:lvlJc w:val="left"/>
+      <w:pPr>
+        <w:ind w:left="720" w:hanging="360"/>
+      </w:pPr>
+      <w:rPr>
+        <w:rFonts w:hint="default"/>
+      </w:rPr>
+    </w:lvl>
+    <w:lvl w:ilvl="1" w:tplc="04090019" w:tentative="1">
+      <w:start w:val="1"/>
+      <w:numFmt w:val="lowerLetter"/>
+      <w:lvlText w:val="%2."/>
+      <w:lvlJc w:val="left"/>
+      <w:pPr>
+        <w:ind w:left="1440" w:hanging="360"/>
+      </w:pPr>
+    </w:lvl>
+    <w:lvl w:ilvl="2" w:tplc="0409001B" w:tentative="1">
+      <w:start w:val="1"/>
+      <w:numFmt w:val="lowerRoman"/>
+      <w:lvlText w:val="%3."/>
+      <w:lvlJc w:val="right"/>
+      <w:pPr>
+        <w:ind w:left="2160" w:hanging="180"/>
+      </w:pPr>
+    </w:lvl>
+    <w:lvl w:ilvl="3" w:tplc="0409000F" w:tentative="1">
+      <w:start w:val="1"/>
+      <w:numFmt w:val="decimal"/>
+      <w:lvlText w:val="%4."/>
+      <w:lvlJc w:val="left"/>
+      <w:pPr>
+        <w:ind w:left="2880" w:hanging="360"/>
+      </w:pPr>
+    </w:lvl>
+    <w:lvl w:ilvl="4" w:tplc="04090019" w:tentative="1">
+      <w:start w:val="1"/>
+      <w:numFmt w:val="lowerLetter"/>
+      <w:lvlText w:val="%5."/>
+      <w:lvlJc w:val="left"/>
+      <w:pPr>
+        <w:ind w:left="3600" w:hanging="360"/>
+      </w:pPr>
+    </w:lvl>
+    <w:lvl w:ilvl="5" w:tplc="0409001B" w:tentative="1">
+      <w:start w:val="1"/>
+      <w:numFmt w:val="lowerRoman"/>
+      <w:lvlText w:val="%6."/>
+      <w:lvlJc w:val="right"/>
+      <w:pPr>
+        <w:ind w:left="4320" w:hanging="180"/>
+      </w:pPr>
+    </w:lvl>
+    <w:lvl w:ilvl="6" w:tplc="0409000F" w:tentative="1">
+      <w:start w:val="1"/>
+      <w:numFmt w:val="decimal"/>
+      <w:lvlText w:val="%7."/>
+      <w:lvlJc w:val="left"/>
+      <w:pPr>
+        <w:ind w:left="5040" w:hanging="360"/>
+      </w:pPr>
+    </w:lvl>
+    <w:lvl w:ilvl="7" w:tplc="04090019" w:tentative="1">
+      <w:start w:val="1"/>
+      <w:numFmt w:val="lowerLetter"/>
+      <w:lvlText w:val="%8."/>
+      <w:lvlJc w:val="left"/>
+      <w:pPr>
+        <w:ind w:left="5760" w:hanging="360"/>
+      </w:pPr>
+    </w:lvl>
+    <w:lvl w:ilvl="8" w:tplc="0409001B" w:tentative="1">
+      <w:start w:val="1"/>
+      <w:numFmt w:val="lowerRoman"/>
+      <w:lvlText w:val="%9."/>
+      <w:lvlJc w:val="right"/>
+      <w:pPr>
+        <w:ind w:left="6480" w:hanging="180"/>
+      </w:pPr>
+    </w:lvl>
+  </w:abstractNum>
+  <w:abstractNum w:abstractNumId="12" w15:restartNumberingAfterBreak="0">
     <w:nsid w:val="63020DD0"/>
     <w:multiLevelType w:val="multilevel"/>
     <w:tmpl w:val="360E46EE"/>
@@ -6136,7 +9555,7 @@
       </w:rPr>
     </w:lvl>
   </w:abstractNum>
-  <w:abstractNum w:abstractNumId="11" w15:restartNumberingAfterBreak="0">
+  <w:abstractNum w:abstractNumId="13" w15:restartNumberingAfterBreak="0">
     <w:nsid w:val="6C2B03D4"/>
     <w:multiLevelType w:val="multilevel"/>
     <w:tmpl w:val="0C568580"/>
@@ -6285,7 +9704,96 @@
       </w:rPr>
     </w:lvl>
   </w:abstractNum>
-  <w:abstractNum w:abstractNumId="12" w15:restartNumberingAfterBreak="0">
+  <w:abstractNum w:abstractNumId="14" w15:restartNumberingAfterBreak="0">
+    <w:nsid w:val="6D860D62"/>
+    <w:multiLevelType w:val="hybridMultilevel"/>
+    <w:tmpl w:val="53927C04"/>
+    <w:lvl w:ilvl="0" w:tplc="95D0E09C">
+      <w:start w:val="1"/>
+      <w:numFmt w:val="decimalFullWidth"/>
+      <w:lvlText w:val="%1-"/>
+      <w:lvlJc w:val="left"/>
+      <w:pPr>
+        <w:ind w:left="720" w:hanging="360"/>
+      </w:pPr>
+      <w:rPr>
+        <w:rFonts w:hint="default"/>
+      </w:rPr>
+    </w:lvl>
+    <w:lvl w:ilvl="1" w:tplc="04090019" w:tentative="1">
+      <w:start w:val="1"/>
+      <w:numFmt w:val="lowerLetter"/>
+      <w:lvlText w:val="%2."/>
+      <w:lvlJc w:val="left"/>
+      <w:pPr>
+        <w:ind w:left="1440" w:hanging="360"/>
+      </w:pPr>
+    </w:lvl>
+    <w:lvl w:ilvl="2" w:tplc="0409001B" w:tentative="1">
+      <w:start w:val="1"/>
+      <w:numFmt w:val="lowerRoman"/>
+      <w:lvlText w:val="%3."/>
+      <w:lvlJc w:val="right"/>
+      <w:pPr>
+        <w:ind w:left="2160" w:hanging="180"/>
+      </w:pPr>
+    </w:lvl>
+    <w:lvl w:ilvl="3" w:tplc="0409000F" w:tentative="1">
+      <w:start w:val="1"/>
+      <w:numFmt w:val="decimal"/>
+      <w:lvlText w:val="%4."/>
+      <w:lvlJc w:val="left"/>
+      <w:pPr>
+        <w:ind w:left="2880" w:hanging="360"/>
+      </w:pPr>
+    </w:lvl>
+    <w:lvl w:ilvl="4" w:tplc="04090019" w:tentative="1">
+      <w:start w:val="1"/>
+      <w:numFmt w:val="lowerLetter"/>
+      <w:lvlText w:val="%5."/>
+      <w:lvlJc w:val="left"/>
+      <w:pPr>
+        <w:ind w:left="3600" w:hanging="360"/>
+      </w:pPr>
+    </w:lvl>
+    <w:lvl w:ilvl="5" w:tplc="0409001B" w:tentative="1">
+      <w:start w:val="1"/>
+      <w:numFmt w:val="lowerRoman"/>
+      <w:lvlText w:val="%6."/>
+      <w:lvlJc w:val="right"/>
+      <w:pPr>
+        <w:ind w:left="4320" w:hanging="180"/>
+      </w:pPr>
+    </w:lvl>
+    <w:lvl w:ilvl="6" w:tplc="0409000F" w:tentative="1">
+      <w:start w:val="1"/>
+      <w:numFmt w:val="decimal"/>
+      <w:lvlText w:val="%7."/>
+      <w:lvlJc w:val="left"/>
+      <w:pPr>
+        <w:ind w:left="5040" w:hanging="360"/>
+      </w:pPr>
+    </w:lvl>
+    <w:lvl w:ilvl="7" w:tplc="04090019" w:tentative="1">
+      <w:start w:val="1"/>
+      <w:numFmt w:val="lowerLetter"/>
+      <w:lvlText w:val="%8."/>
+      <w:lvlJc w:val="left"/>
+      <w:pPr>
+        <w:ind w:left="5760" w:hanging="360"/>
+      </w:pPr>
+    </w:lvl>
+    <w:lvl w:ilvl="8" w:tplc="0409001B" w:tentative="1">
+      <w:start w:val="1"/>
+      <w:numFmt w:val="lowerRoman"/>
+      <w:lvlText w:val="%9."/>
+      <w:lvlJc w:val="right"/>
+      <w:pPr>
+        <w:ind w:left="6480" w:hanging="180"/>
+      </w:pPr>
+    </w:lvl>
+  </w:abstractNum>
+  <w:abstractNum w:abstractNumId="15" w15:restartNumberingAfterBreak="0">
     <w:nsid w:val="71046E90"/>
     <w:multiLevelType w:val="multilevel"/>
     <w:tmpl w:val="A80A29C0"/>
@@ -6434,7 +9942,7 @@
       </w:rPr>
     </w:lvl>
   </w:abstractNum>
-  <w:abstractNum w:abstractNumId="13" w15:restartNumberingAfterBreak="0">
+  <w:abstractNum w:abstractNumId="16" w15:restartNumberingAfterBreak="0">
     <w:nsid w:val="757A2355"/>
     <w:multiLevelType w:val="hybridMultilevel"/>
     <w:tmpl w:val="CA84B00A"/>
@@ -6523,7 +10031,7 @@
       </w:pPr>
     </w:lvl>
   </w:abstractNum>
-  <w:abstractNum w:abstractNumId="14" w15:restartNumberingAfterBreak="0">
+  <w:abstractNum w:abstractNumId="17" w15:restartNumberingAfterBreak="0">
     <w:nsid w:val="7A845F69"/>
     <w:multiLevelType w:val="multilevel"/>
     <w:tmpl w:val="17A8C5D2"/>
@@ -6673,13 +10181,13 @@
     </w:lvl>
   </w:abstractNum>
   <w:num w:numId="1" w16cid:durableId="1409185744">
-    <w:abstractNumId w:val="13"/>
+    <w:abstractNumId w:val="16"/>
   </w:num>
   <w:num w:numId="2" w16cid:durableId="1626427615">
     <w:abstractNumId w:val="7"/>
   </w:num>
   <w:num w:numId="3" w16cid:durableId="1320498891">
-    <w:abstractNumId w:val="8"/>
+    <w:abstractNumId w:val="9"/>
   </w:num>
   <w:num w:numId="4" w16cid:durableId="1080174084">
     <w:abstractNumId w:val="1"/>
@@ -6688,13 +10196,13 @@
     <w:abstractNumId w:val="0"/>
   </w:num>
   <w:num w:numId="6" w16cid:durableId="2039087405">
-    <w:abstractNumId w:val="11"/>
+    <w:abstractNumId w:val="13"/>
   </w:num>
   <w:num w:numId="7" w16cid:durableId="1227761942">
     <w:abstractNumId w:val="4"/>
   </w:num>
   <w:num w:numId="8" w16cid:durableId="1138841852">
-    <w:abstractNumId w:val="14"/>
+    <w:abstractNumId w:val="17"/>
   </w:num>
   <w:num w:numId="9" w16cid:durableId="208107564">
     <w:abstractNumId w:val="6"/>
@@ -6706,16 +10214,25 @@
     <w:abstractNumId w:val="3"/>
   </w:num>
   <w:num w:numId="12" w16cid:durableId="153953202">
-    <w:abstractNumId w:val="12"/>
+    <w:abstractNumId w:val="15"/>
   </w:num>
   <w:num w:numId="13" w16cid:durableId="1635330904">
-    <w:abstractNumId w:val="9"/>
+    <w:abstractNumId w:val="10"/>
   </w:num>
   <w:num w:numId="14" w16cid:durableId="944968319">
     <w:abstractNumId w:val="5"/>
   </w:num>
   <w:num w:numId="15" w16cid:durableId="1099105969">
-    <w:abstractNumId w:val="10"/>
+    <w:abstractNumId w:val="12"/>
+  </w:num>
+  <w:num w:numId="16" w16cid:durableId="286356591">
+    <w:abstractNumId w:val="8"/>
+  </w:num>
+  <w:num w:numId="17" w16cid:durableId="719600320">
+    <w:abstractNumId w:val="11"/>
+  </w:num>
+  <w:num w:numId="18" w16cid:durableId="170730029">
+    <w:abstractNumId w:val="14"/>
   </w:num>
 </w:numbering>
 </file>
@@ -7141,7 +10658,7 @@
     <w:autoRedefine/>
     <w:uiPriority w:val="9"/>
     <w:qFormat/>
-    <w:rsid w:val="0022625F"/>
+    <w:rsid w:val="009970F5"/>
     <w:pPr>
       <w:keepNext/>
       <w:keepLines/>
@@ -7154,8 +10671,8 @@
       <w:rFonts w:ascii="B Titr" w:eastAsiaTheme="majorEastAsia" w:hAnsi="B Titr" w:cs="B Titr"/>
       <w:bCs/>
       <w:color w:val="000000" w:themeColor="text1"/>
-      <w:sz w:val="48"/>
-      <w:szCs w:val="48"/>
+      <w:sz w:val="40"/>
+      <w:szCs w:val="40"/>
     </w:rPr>
   </w:style>
   <w:style w:type="paragraph" w:styleId="Heading2">
@@ -7167,12 +10684,13 @@
     <w:uiPriority w:val="9"/>
     <w:unhideWhenUsed/>
     <w:qFormat/>
-    <w:rsid w:val="0022625F"/>
+    <w:rsid w:val="009970F5"/>
     <w:pPr>
       <w:keepNext/>
       <w:keepLines/>
-      <w:spacing w:before="40" w:after="0" w:line="360" w:lineRule="auto"/>
+      <w:spacing w:before="40" w:after="0" w:line="240" w:lineRule="auto"/>
       <w:ind w:left="0"/>
+      <w:jc w:val="left"/>
       <w:outlineLvl w:val="1"/>
     </w:pPr>
     <w:rPr>
@@ -7215,13 +10733,13 @@
     <w:basedOn w:val="DefaultParagraphFont"/>
     <w:link w:val="Heading1"/>
     <w:uiPriority w:val="9"/>
-    <w:rsid w:val="0022625F"/>
+    <w:rsid w:val="009970F5"/>
     <w:rPr>
       <w:rFonts w:ascii="B Titr" w:eastAsiaTheme="majorEastAsia" w:hAnsi="B Titr" w:cs="B Titr"/>
       <w:bCs/>
       <w:color w:val="000000" w:themeColor="text1"/>
-      <w:sz w:val="48"/>
-      <w:szCs w:val="48"/>
+      <w:sz w:val="40"/>
+      <w:szCs w:val="40"/>
     </w:rPr>
   </w:style>
   <w:style w:type="character" w:customStyle="1" w:styleId="Heading2Char">
@@ -7229,7 +10747,7 @@
     <w:basedOn w:val="DefaultParagraphFont"/>
     <w:link w:val="Heading2"/>
     <w:uiPriority w:val="9"/>
-    <w:rsid w:val="0022625F"/>
+    <w:rsid w:val="009970F5"/>
     <w:rPr>
       <w:rFonts w:ascii="B Titr" w:eastAsia="B Titr" w:hAnsi="B Titr" w:cs="B Titr"/>
       <w:bCs/>
@@ -7314,6 +10832,66 @@
       <w:rFonts w:ascii="B Nazanin" w:hAnsi="B Nazanin" w:cs="B Nazanin"/>
       <w:sz w:val="28"/>
       <w:szCs w:val="28"/>
+    </w:rPr>
+  </w:style>
+  <w:style w:type="paragraph" w:styleId="TOCHeading">
+    <w:name w:val="TOC Heading"/>
+    <w:basedOn w:val="Heading1"/>
+    <w:next w:val="Normal"/>
+    <w:uiPriority w:val="39"/>
+    <w:unhideWhenUsed/>
+    <w:qFormat/>
+    <w:rsid w:val="009970F5"/>
+    <w:pPr>
+      <w:bidi w:val="0"/>
+      <w:spacing w:line="259" w:lineRule="auto"/>
+      <w:outlineLvl w:val="9"/>
+    </w:pPr>
+    <w:rPr>
+      <w:rFonts w:asciiTheme="majorHAnsi" w:hAnsiTheme="majorHAnsi" w:cstheme="majorBidi"/>
+      <w:bCs w:val="0"/>
+      <w:color w:val="2F5496" w:themeColor="accent1" w:themeShade="BF"/>
+      <w:kern w:val="0"/>
+      <w:sz w:val="32"/>
+      <w:szCs w:val="32"/>
+      <w14:ligatures w14:val="none"/>
+    </w:rPr>
+  </w:style>
+  <w:style w:type="paragraph" w:styleId="TOC1">
+    <w:name w:val="toc 1"/>
+    <w:basedOn w:val="Normal"/>
+    <w:next w:val="Normal"/>
+    <w:autoRedefine/>
+    <w:uiPriority w:val="39"/>
+    <w:unhideWhenUsed/>
+    <w:rsid w:val="009970F5"/>
+    <w:pPr>
+      <w:spacing w:after="100"/>
+      <w:ind w:left="0"/>
+    </w:pPr>
+  </w:style>
+  <w:style w:type="paragraph" w:styleId="TOC2">
+    <w:name w:val="toc 2"/>
+    <w:basedOn w:val="Normal"/>
+    <w:next w:val="Normal"/>
+    <w:autoRedefine/>
+    <w:uiPriority w:val="39"/>
+    <w:unhideWhenUsed/>
+    <w:rsid w:val="009970F5"/>
+    <w:pPr>
+      <w:spacing w:after="100"/>
+      <w:ind w:left="280"/>
+    </w:pPr>
+  </w:style>
+  <w:style w:type="character" w:styleId="Hyperlink">
+    <w:name w:val="Hyperlink"/>
+    <w:basedOn w:val="DefaultParagraphFont"/>
+    <w:uiPriority w:val="99"/>
+    <w:unhideWhenUsed/>
+    <w:rsid w:val="009970F5"/>
+    <w:rPr>
+      <w:color w:val="0563C1" w:themeColor="hyperlink"/>
+      <w:u w:val="single"/>
     </w:rPr>
   </w:style>
 </w:styles>
@@ -7612,4 +11190,16 @@
     </a:ext>
   </a:extLst>
 </a:theme>
+</file>
+
+<file path=customXml/item1.xml><?xml version="1.0" encoding="utf-8"?>
+<b:Sources xmlns:b="http://schemas.openxmlformats.org/officeDocument/2006/bibliography" xmlns="http://schemas.openxmlformats.org/officeDocument/2006/bibliography" SelectedStyle="\APASixthEditionOfficeOnline.xsl" StyleName="APA" Version="6"/>
+</file>
+
+<file path=customXml/itemProps1.xml><?xml version="1.0" encoding="utf-8"?>
+<ds:datastoreItem xmlns:ds="http://schemas.openxmlformats.org/officeDocument/2006/customXml" ds:itemID="{53D98DD6-B489-4509-86C9-BFF80C69DCE2}">
+  <ds:schemaRefs>
+    <ds:schemaRef ds:uri="http://schemas.openxmlformats.org/officeDocument/2006/bibliography"/>
+  </ds:schemaRefs>
+</ds:datastoreItem>
 </file>
</xml_diff>

<commit_message>
end of az os project
</commit_message>
<xml_diff>
--- a/آز سیستم عامل/ارائه سیستم عامل.docx
+++ b/آز سیستم عامل/ارائه سیستم عامل.docx
@@ -71,6 +71,14 @@
     </w:p>
     <w:sdt>
       <w:sdtPr>
+        <w:rPr>
+          <w:rFonts w:ascii="B Nazanin" w:eastAsiaTheme="minorHAnsi" w:hAnsi="B Nazanin" w:cs="B Nazanin"/>
+          <w:color w:val="auto"/>
+          <w:kern w:val="2"/>
+          <w:sz w:val="28"/>
+          <w:szCs w:val="28"/>
+          <w14:ligatures w14:val="standardContextual"/>
+        </w:rPr>
         <w:id w:val="-1390422879"/>
         <w:docPartObj>
           <w:docPartGallery w:val="Table of Contents"/>
@@ -79,16 +87,10 @@
       </w:sdtPr>
       <w:sdtEndPr>
         <w:rPr>
-          <w:rFonts w:ascii="B Nazanin" w:eastAsiaTheme="minorHAnsi" w:hAnsi="B Nazanin" w:cs="B Nazanin"/>
           <w:b/>
           <w:bCs/>
           <w:noProof/>
-          <w:color w:val="auto"/>
-          <w:kern w:val="2"/>
-          <w:sz w:val="28"/>
-          <w:szCs w:val="28"/>
-          <w:rtl/>
-          <w14:ligatures w14:val="standardContextual"/>
+          <w:rtl/>
         </w:rPr>
       </w:sdtEndPr>
       <w:sdtContent>
@@ -100,7 +102,6 @@
             </w:tabs>
             <w:jc w:val="center"/>
             <w:rPr>
-              <w:rFonts w:hint="cs"/>
               <w:rtl/>
               <w:lang w:bidi="fa-IR"/>
             </w:rPr>
@@ -1428,7 +1429,7 @@
           <w:rtl/>
           <w:lang w:bidi="fa-IR"/>
         </w:rPr>
-        <w:t>عدم جداسازی و محافظت: هر برنامه که توسط کامپیوتر اجرا شود توانایی این رو دارد که به هر قسمت از حافظه درسترسی داشته باشد و این باعث میشود که اگر برنامه مخربی اجرا شود میتواند به تمام خانه های حافظه دسترسی داشته باشد و باعث خرابی دیگر برنامه ها شود.</w:t>
+        <w:t>عدم جداسازی و محافظت: هر برنامه که توسط کامپیوتر اجرا شود توانایی این رو دارد که به هر قسمت از حافظه دسترسی داشته باشد و این باعث میشود که اگر برنامه مخربی اجرا شود میتواند به تمام خانه های حافظه دسترسی داشته باشد و باعث خرابی دیگر برنامه ها شود.</w:t>
       </w:r>
     </w:p>
     <w:p>
@@ -5800,17 +5801,8 @@
           <w:rFonts w:asciiTheme="minorHAnsi" w:hAnsiTheme="minorHAnsi"/>
           <w:lang w:bidi="fa-IR"/>
         </w:rPr>
-        <w:t xml:space="preserve">batch </w:t>
-      </w:r>
-      <w:proofErr w:type="spellStart"/>
-      <w:r>
-        <w:rPr>
-          <w:rFonts w:asciiTheme="minorHAnsi" w:hAnsiTheme="minorHAnsi"/>
-          <w:lang w:bidi="fa-IR"/>
-        </w:rPr>
-        <w:t>os</w:t>
-      </w:r>
-      <w:proofErr w:type="spellEnd"/>
+        <w:t>batch os</w:t>
+      </w:r>
       <w:r>
         <w:rPr>
           <w:rFonts w:asciiTheme="minorHAnsi" w:hAnsiTheme="minorHAnsi" w:hint="cs"/>
@@ -5909,17 +5901,8 @@
           <w:rFonts w:asciiTheme="minorHAnsi" w:hAnsiTheme="minorHAnsi"/>
           <w:lang w:bidi="fa-IR"/>
         </w:rPr>
-        <w:t xml:space="preserve">time sharing </w:t>
-      </w:r>
-      <w:proofErr w:type="spellStart"/>
-      <w:r>
-        <w:rPr>
-          <w:rFonts w:asciiTheme="minorHAnsi" w:hAnsiTheme="minorHAnsi"/>
-          <w:lang w:bidi="fa-IR"/>
-        </w:rPr>
-        <w:t>os</w:t>
-      </w:r>
-      <w:proofErr w:type="spellEnd"/>
+        <w:t>time sharing os</w:t>
+      </w:r>
       <w:r>
         <w:rPr>
           <w:rFonts w:asciiTheme="minorHAnsi" w:hAnsiTheme="minorHAnsi" w:hint="cs"/>
@@ -6009,17 +5992,8 @@
           <w:rFonts w:asciiTheme="minorHAnsi" w:hAnsiTheme="minorHAnsi"/>
           <w:lang w:bidi="fa-IR"/>
         </w:rPr>
-        <w:t xml:space="preserve">real time </w:t>
-      </w:r>
-      <w:proofErr w:type="spellStart"/>
-      <w:r>
-        <w:rPr>
-          <w:rFonts w:asciiTheme="minorHAnsi" w:hAnsiTheme="minorHAnsi"/>
-          <w:lang w:bidi="fa-IR"/>
-        </w:rPr>
-        <w:t>os</w:t>
-      </w:r>
-      <w:proofErr w:type="spellEnd"/>
+        <w:t>real time os</w:t>
+      </w:r>
       <w:r>
         <w:rPr>
           <w:rFonts w:asciiTheme="minorHAnsi" w:hAnsiTheme="minorHAnsi" w:hint="cs"/>
@@ -6044,7 +6018,6 @@
         </w:rPr>
         <w:t xml:space="preserve">این سیستم عامل ها بخاطر زمان پاسخ دهی بسیار پایین مناسب برای سیستم های تعبیه شده در صنایع است. از این دسته سیستم عامل ها میتوان به </w:t>
       </w:r>
-      <w:proofErr w:type="spellStart"/>
       <w:r>
         <w:rPr>
           <w:rFonts w:asciiTheme="minorHAnsi" w:hAnsiTheme="minorHAnsi"/>
@@ -6052,7 +6025,6 @@
         </w:rPr>
         <w:t>RTLinux</w:t>
       </w:r>
-      <w:proofErr w:type="spellEnd"/>
       <w:r>
         <w:rPr>
           <w:rFonts w:asciiTheme="minorHAnsi" w:hAnsiTheme="minorHAnsi" w:hint="cs"/>
@@ -6088,17 +6060,8 @@
           <w:rFonts w:asciiTheme="minorHAnsi" w:hAnsiTheme="minorHAnsi"/>
           <w:lang w:bidi="fa-IR"/>
         </w:rPr>
-        <w:t xml:space="preserve">network </w:t>
-      </w:r>
-      <w:proofErr w:type="spellStart"/>
-      <w:r>
-        <w:rPr>
-          <w:rFonts w:asciiTheme="minorHAnsi" w:hAnsiTheme="minorHAnsi"/>
-          <w:lang w:bidi="fa-IR"/>
-        </w:rPr>
-        <w:t>os</w:t>
-      </w:r>
-      <w:proofErr w:type="spellEnd"/>
+        <w:t>network os</w:t>
+      </w:r>
       <w:r>
         <w:rPr>
           <w:rFonts w:asciiTheme="minorHAnsi" w:hAnsiTheme="minorHAnsi" w:hint="cs"/>
@@ -6123,21 +6086,12 @@
         </w:rPr>
         <w:t xml:space="preserve">از این دسته سیستم عامل ها میتوان به </w:t>
       </w:r>
-      <w:proofErr w:type="spellStart"/>
-      <w:r>
-        <w:rPr>
-          <w:rFonts w:asciiTheme="minorHAnsi" w:hAnsiTheme="minorHAnsi"/>
-          <w:lang w:bidi="fa-IR"/>
-        </w:rPr>
-        <w:t>windos</w:t>
-      </w:r>
-      <w:proofErr w:type="spellEnd"/>
-      <w:r>
-        <w:rPr>
-          <w:rFonts w:asciiTheme="minorHAnsi" w:hAnsiTheme="minorHAnsi"/>
-          <w:lang w:bidi="fa-IR"/>
-        </w:rPr>
-        <w:t xml:space="preserve"> server</w:t>
+      <w:r>
+        <w:rPr>
+          <w:rFonts w:asciiTheme="minorHAnsi" w:hAnsiTheme="minorHAnsi"/>
+          <w:lang w:bidi="fa-IR"/>
+        </w:rPr>
+        <w:t>windos server</w:t>
       </w:r>
       <w:r>
         <w:rPr>
@@ -6182,17 +6136,8 @@
           <w:rFonts w:asciiTheme="minorHAnsi" w:hAnsiTheme="minorHAnsi"/>
           <w:lang w:bidi="fa-IR"/>
         </w:rPr>
-        <w:t xml:space="preserve"> </w:t>
-      </w:r>
-      <w:proofErr w:type="spellStart"/>
-      <w:r>
-        <w:rPr>
-          <w:rFonts w:asciiTheme="minorHAnsi" w:hAnsiTheme="minorHAnsi"/>
-          <w:lang w:bidi="fa-IR"/>
-        </w:rPr>
-        <w:t>os</w:t>
-      </w:r>
-      <w:proofErr w:type="spellEnd"/>
+        <w:t xml:space="preserve"> os</w:t>
+      </w:r>
       <w:r>
         <w:rPr>
           <w:rFonts w:asciiTheme="minorHAnsi" w:hAnsiTheme="minorHAnsi" w:hint="cs"/>
@@ -6251,17 +6196,8 @@
           <w:rFonts w:asciiTheme="minorHAnsi" w:hAnsiTheme="minorHAnsi"/>
           <w:lang w:bidi="fa-IR"/>
         </w:rPr>
-        <w:t xml:space="preserve">mobile </w:t>
-      </w:r>
-      <w:proofErr w:type="spellStart"/>
-      <w:r>
-        <w:rPr>
-          <w:rFonts w:asciiTheme="minorHAnsi" w:hAnsiTheme="minorHAnsi"/>
-          <w:lang w:bidi="fa-IR"/>
-        </w:rPr>
-        <w:t>os</w:t>
-      </w:r>
-      <w:proofErr w:type="spellEnd"/>
+        <w:t>mobile os</w:t>
+      </w:r>
       <w:r>
         <w:rPr>
           <w:rFonts w:asciiTheme="minorHAnsi" w:hAnsiTheme="minorHAnsi" w:hint="cs"/>
@@ -6275,17 +6211,8 @@
           <w:rFonts w:asciiTheme="minorHAnsi" w:hAnsiTheme="minorHAnsi"/>
           <w:lang w:bidi="fa-IR"/>
         </w:rPr>
-        <w:t xml:space="preserve">android, </w:t>
-      </w:r>
-      <w:proofErr w:type="spellStart"/>
-      <w:r>
-        <w:rPr>
-          <w:rFonts w:asciiTheme="minorHAnsi" w:hAnsiTheme="minorHAnsi"/>
-          <w:lang w:bidi="fa-IR"/>
-        </w:rPr>
-        <w:t>ios</w:t>
-      </w:r>
-      <w:proofErr w:type="spellEnd"/>
+        <w:t>android, ios</w:t>
+      </w:r>
       <w:r>
         <w:rPr>
           <w:rFonts w:asciiTheme="minorHAnsi" w:hAnsiTheme="minorHAnsi" w:hint="cs"/>
@@ -6669,17 +6596,8 @@
           <w:rFonts w:asciiTheme="minorHAnsi" w:hAnsiTheme="minorHAnsi"/>
           <w:lang w:bidi="fa-IR"/>
         </w:rPr>
-        <w:t xml:space="preserve">windows </w:t>
-      </w:r>
-      <w:proofErr w:type="spellStart"/>
-      <w:r>
-        <w:rPr>
-          <w:rFonts w:asciiTheme="minorHAnsi" w:hAnsiTheme="minorHAnsi"/>
-          <w:lang w:bidi="fa-IR"/>
-        </w:rPr>
-        <w:t>nt</w:t>
-      </w:r>
-      <w:proofErr w:type="spellEnd"/>
+        <w:t>windows nt</w:t>
+      </w:r>
     </w:p>
     <w:p>
       <w:pPr>
@@ -7073,17 +6991,8 @@
           <w:rFonts w:asciiTheme="minorHAnsi" w:hAnsiTheme="minorHAnsi"/>
           <w:lang w:bidi="fa-IR"/>
         </w:rPr>
-        <w:t xml:space="preserve">Mac </w:t>
-      </w:r>
-      <w:proofErr w:type="spellStart"/>
-      <w:r>
-        <w:rPr>
-          <w:rFonts w:asciiTheme="minorHAnsi" w:hAnsiTheme="minorHAnsi"/>
-          <w:lang w:bidi="fa-IR"/>
-        </w:rPr>
-        <w:t>os</w:t>
-      </w:r>
-      <w:proofErr w:type="spellEnd"/>
+        <w:t>Mac os</w:t>
+      </w:r>
       <w:r>
         <w:rPr>
           <w:rFonts w:asciiTheme="minorHAnsi" w:hAnsiTheme="minorHAnsi" w:hint="cs"/>
@@ -7174,17 +7083,8 @@
           <w:rFonts w:asciiTheme="minorHAnsi" w:hAnsiTheme="minorHAnsi"/>
           <w:lang w:bidi="fa-IR"/>
         </w:rPr>
-        <w:t xml:space="preserve">Mac </w:t>
-      </w:r>
-      <w:proofErr w:type="spellStart"/>
-      <w:r>
-        <w:rPr>
-          <w:rFonts w:asciiTheme="minorHAnsi" w:hAnsiTheme="minorHAnsi"/>
-          <w:lang w:bidi="fa-IR"/>
-        </w:rPr>
-        <w:t>os</w:t>
-      </w:r>
-      <w:proofErr w:type="spellEnd"/>
+        <w:t>Mac os</w:t>
+      </w:r>
       <w:r>
         <w:rPr>
           <w:rFonts w:asciiTheme="minorHAnsi" w:hAnsiTheme="minorHAnsi" w:hint="cs"/>
@@ -7214,17 +7114,8 @@
           <w:rFonts w:asciiTheme="minorHAnsi" w:hAnsiTheme="minorHAnsi"/>
           <w:lang w:bidi="fa-IR"/>
         </w:rPr>
-        <w:t xml:space="preserve">Mac </w:t>
-      </w:r>
-      <w:proofErr w:type="spellStart"/>
-      <w:r>
-        <w:rPr>
-          <w:rFonts w:asciiTheme="minorHAnsi" w:hAnsiTheme="minorHAnsi"/>
-          <w:lang w:bidi="fa-IR"/>
-        </w:rPr>
-        <w:t>os</w:t>
-      </w:r>
-      <w:proofErr w:type="spellEnd"/>
+        <w:t>Mac os</w:t>
+      </w:r>
       <w:r>
         <w:rPr>
           <w:rFonts w:asciiTheme="minorHAnsi" w:hAnsiTheme="minorHAnsi" w:hint="cs"/>
@@ -7319,7 +7210,6 @@
         </w:rPr>
         <w:t xml:space="preserve">۳- </w:t>
       </w:r>
-      <w:proofErr w:type="spellStart"/>
       <w:r>
         <w:rPr>
           <w:rFonts w:asciiTheme="minorHAnsi" w:hAnsiTheme="minorHAnsi"/>
@@ -7327,7 +7217,6 @@
         </w:rPr>
         <w:t>IOKit</w:t>
       </w:r>
-      <w:proofErr w:type="spellEnd"/>
       <w:r>
         <w:rPr>
           <w:rFonts w:asciiTheme="minorHAnsi" w:hAnsiTheme="minorHAnsi" w:hint="cs"/>
@@ -7336,7 +7225,6 @@
         </w:rPr>
         <w:t xml:space="preserve">: چهارچوب درایور های سخت افزاری با زبان </w:t>
       </w:r>
-      <w:proofErr w:type="spellStart"/>
       <w:r>
         <w:rPr>
           <w:rFonts w:asciiTheme="minorHAnsi" w:hAnsiTheme="minorHAnsi"/>
@@ -7344,7 +7232,6 @@
         </w:rPr>
         <w:t>cpp</w:t>
       </w:r>
-      <w:proofErr w:type="spellEnd"/>
       <w:r>
         <w:rPr>
           <w:rFonts w:asciiTheme="minorHAnsi" w:hAnsiTheme="minorHAnsi"/>
@@ -7397,17 +7284,8 @@
           <w:rFonts w:asciiTheme="minorHAnsi" w:hAnsiTheme="minorHAnsi"/>
           <w:lang w:bidi="fa-IR"/>
         </w:rPr>
-        <w:t xml:space="preserve">Mac </w:t>
-      </w:r>
-      <w:proofErr w:type="spellStart"/>
-      <w:r>
-        <w:rPr>
-          <w:rFonts w:asciiTheme="minorHAnsi" w:hAnsiTheme="minorHAnsi"/>
-          <w:lang w:bidi="fa-IR"/>
-        </w:rPr>
-        <w:t>os</w:t>
-      </w:r>
-      <w:proofErr w:type="spellEnd"/>
+        <w:t>Mac os</w:t>
+      </w:r>
       <w:r>
         <w:rPr>
           <w:rFonts w:asciiTheme="minorHAnsi" w:hAnsiTheme="minorHAnsi" w:hint="cs"/>
@@ -7454,7 +7332,6 @@
         </w:rPr>
         <w:t xml:space="preserve">سیستم عامل </w:t>
       </w:r>
-      <w:proofErr w:type="spellStart"/>
       <w:r>
         <w:rPr>
           <w:rFonts w:asciiTheme="minorHAnsi" w:hAnsiTheme="minorHAnsi"/>
@@ -7462,7 +7339,6 @@
         </w:rPr>
         <w:t>linux</w:t>
       </w:r>
-      <w:proofErr w:type="spellEnd"/>
       <w:r>
         <w:rPr>
           <w:rFonts w:asciiTheme="minorHAnsi" w:hAnsiTheme="minorHAnsi" w:hint="cs"/>
@@ -7728,7 +7604,7 @@
       <w:pPr>
         <w:jc w:val="left"/>
         <w:rPr>
-          <w:rFonts w:asciiTheme="minorHAnsi" w:hAnsiTheme="minorHAnsi" w:hint="cs"/>
+          <w:rFonts w:asciiTheme="minorHAnsi" w:hAnsiTheme="minorHAnsi"/>
           <w:lang w:bidi="fa-IR"/>
         </w:rPr>
       </w:pPr>
@@ -10704,6 +10580,7 @@
   <w:style w:type="character" w:default="1" w:styleId="DefaultParagraphFont">
     <w:name w:val="Default Paragraph Font"/>
     <w:uiPriority w:val="1"/>
+    <w:semiHidden/>
     <w:unhideWhenUsed/>
   </w:style>
   <w:style w:type="table" w:default="1" w:styleId="TableNormal">

</xml_diff>